<commit_message>
Stabilize report generation: staged pipeline, zero-photo support, per-project signatures, and weather/signature UI
</commit_message>
<xml_diff>
--- a/templates/CEI_Base_Template_Refined.docx
+++ b/templates/CEI_Base_Template_Refined.docx
@@ -1,6 +1,6 @@
 
 <file path=word/document.xml><?xml version="1.0" encoding="utf-8"?>
-<w:document xmlns:wpc="http://schemas.microsoft.com/office/word/2010/wordprocessingCanvas" xmlns:cx="http://schemas.microsoft.com/office/drawing/2014/chartex" xmlns:cx1="http://schemas.microsoft.com/office/drawing/2015/9/8/chartex" xmlns:cx2="http://schemas.microsoft.com/office/drawing/2015/10/21/chartex" xmlns:cx3="http://schemas.microsoft.com/office/drawing/2016/5/9/chartex" xmlns:cx4="http://schemas.microsoft.com/office/drawing/2016/5/10/chartex" xmlns:cx5="http://schemas.microsoft.com/office/drawing/2016/5/11/chartex" xmlns:cx6="http://schemas.microsoft.com/office/drawing/2016/5/12/chartex" xmlns:cx7="http://schemas.microsoft.com/office/drawing/2016/5/13/chartex" xmlns:cx8="http://schemas.microsoft.com/office/drawing/2016/5/14/chartex" xmlns:mc="http://schemas.openxmlformats.org/markup-compatibility/2006" xmlns:aink="http://schemas.microsoft.com/office/drawing/2016/ink" xmlns:am3d="http://schemas.microsoft.com/office/drawing/2017/model3d" xmlns:o="urn:schemas-microsoft-com:office:office" xmlns:oel="http://schemas.microsoft.com/office/2019/extlst" xmlns:r="http://schemas.openxmlformats.org/officeDocument/2006/relationships" xmlns:m="http://schemas.openxmlformats.org/officeDocument/2006/math" xmlns:v="urn:schemas-microsoft-com:vml" xmlns:wp14="http://schemas.microsoft.com/office/word/2010/wordprocessingDrawing" xmlns:wp="http://schemas.openxmlformats.org/drawingml/2006/wordprocessingDrawing" xmlns:w10="urn:schemas-microsoft-com:office:word" xmlns:w="http://schemas.openxmlformats.org/wordprocessingml/2006/main" xmlns:w14="http://schemas.microsoft.com/office/word/2010/wordml" xmlns:w15="http://schemas.microsoft.com/office/word/2012/wordml" xmlns:w16cex="http://schemas.microsoft.com/office/word/2018/wordml/cex" xmlns:w16cid="http://schemas.microsoft.com/office/word/2016/wordml/cid" xmlns:w16="http://schemas.microsoft.com/office/word/2018/wordml" xmlns:w16du="http://schemas.microsoft.com/office/word/2023/wordml/word16du" xmlns:w16sdtdh="http://schemas.microsoft.com/office/word/2020/wordml/sdtdatahash" xmlns:w16sdtfl="http://schemas.microsoft.com/office/word/2024/wordml/sdtformatlock" xmlns:w16se="http://schemas.microsoft.com/office/word/2015/wordml/symex" xmlns:wpg="http://schemas.microsoft.com/office/word/2010/wordprocessingGroup" xmlns:wpi="http://schemas.microsoft.com/office/word/2010/wordprocessingInk" xmlns:wne="http://schemas.microsoft.com/office/word/2006/wordml" xmlns:wps="http://schemas.microsoft.com/office/word/2010/wordprocessingShape" mc:Ignorable="w14 w15 w16se w16cid w16 w16cex w16sdtdh w16sdtfl w16du wp14">
+<w:document xmlns:a="http://schemas.openxmlformats.org/drawingml/2006/main" xmlns:wpc="http://schemas.microsoft.com/office/word/2010/wordprocessingCanvas" xmlns:cx="http://schemas.microsoft.com/office/drawing/2014/chartex" xmlns:cx1="http://schemas.microsoft.com/office/drawing/2015/9/8/chartex" xmlns:cx2="http://schemas.microsoft.com/office/drawing/2015/10/21/chartex" xmlns:cx3="http://schemas.microsoft.com/office/drawing/2016/5/9/chartex" xmlns:cx4="http://schemas.microsoft.com/office/drawing/2016/5/10/chartex" xmlns:cx5="http://schemas.microsoft.com/office/drawing/2016/5/11/chartex" xmlns:cx6="http://schemas.microsoft.com/office/drawing/2016/5/12/chartex" xmlns:cx7="http://schemas.microsoft.com/office/drawing/2016/5/13/chartex" xmlns:cx8="http://schemas.microsoft.com/office/drawing/2016/5/14/chartex" xmlns:mc="http://schemas.openxmlformats.org/markup-compatibility/2006" xmlns:aink="http://schemas.microsoft.com/office/drawing/2016/ink" xmlns:am3d="http://schemas.microsoft.com/office/drawing/2017/model3d" xmlns:o="urn:schemas-microsoft-com:office:office" xmlns:oel="http://schemas.microsoft.com/office/2019/extlst" xmlns:r="http://schemas.openxmlformats.org/officeDocument/2006/relationships" xmlns:m="http://schemas.openxmlformats.org/officeDocument/2006/math" xmlns:v="urn:schemas-microsoft-com:vml" xmlns:wp14="http://schemas.microsoft.com/office/word/2010/wordprocessingDrawing" xmlns:wp="http://schemas.openxmlformats.org/drawingml/2006/wordprocessingDrawing" xmlns:w10="urn:schemas-microsoft-com:office:word" xmlns:w="http://schemas.openxmlformats.org/wordprocessingml/2006/main" xmlns:w14="http://schemas.microsoft.com/office/word/2010/wordml" xmlns:w15="http://schemas.microsoft.com/office/word/2012/wordml" xmlns:w16cex="http://schemas.microsoft.com/office/word/2018/wordml/cex" xmlns:w16cid="http://schemas.microsoft.com/office/word/2016/wordml/cid" xmlns:w16="http://schemas.microsoft.com/office/word/2018/wordml" xmlns:w16du="http://schemas.microsoft.com/office/word/2023/wordml/word16du" xmlns:w16sdtdh="http://schemas.microsoft.com/office/word/2020/wordml/sdtdatahash" xmlns:w16sdtfl="http://schemas.microsoft.com/office/word/2024/wordml/sdtformatlock" xmlns:w16se="http://schemas.microsoft.com/office/word/2015/wordml/symex" xmlns:wpg="http://schemas.microsoft.com/office/word/2010/wordprocessingGroup" xmlns:wpi="http://schemas.microsoft.com/office/word/2010/wordprocessingInk" xmlns:wne="http://schemas.microsoft.com/office/word/2006/wordml" xmlns:wps="http://schemas.microsoft.com/office/word/2010/wordprocessingShape" mc:Ignorable="w14 w15 w16se w16cid w16 w16cex w16sdtdh w16sdtfl w16du wp14">
   <w:body>
     <w:p>
       <w:pPr>
@@ -8,7 +8,7 @@
         <w:ind w:left="-360"/>
         <w:jc w:val="center"/>
         <w:rPr>
-          <w:rFonts w:ascii="Calibri" w:eastAsiaTheme="minorEastAsia" w:hAnsi="Calibri" w:cs="Calibri"/>
+          <w:rFonts w:ascii="Calibri" w:hAnsi="Calibri" w:cs="Calibri" w:eastAsiaTheme="minorEastAsia"/>
           <w:b/>
           <w:color w:val="58585A"/>
           <w:sz w:val="26"/>
@@ -19,7 +19,7 @@
       </w:pPr>
       <w:r>
         <w:rPr>
-          <w:rFonts w:ascii="Calibri" w:eastAsiaTheme="minorEastAsia" w:hAnsi="Calibri" w:cs="Calibri"/>
+          <w:rFonts w:ascii="Calibri" w:hAnsi="Calibri" w:cs="Calibri" w:eastAsiaTheme="minorEastAsia"/>
           <w:b/>
           <w:sz w:val="26"/>
           <w:szCs w:val="26"/>
@@ -30,7 +30,7 @@
       </w:r>
       <w:r>
         <w:rPr>
-          <w:rFonts w:ascii="Calibri" w:eastAsiaTheme="minorEastAsia" w:hAnsi="Calibri" w:cs="Calibri"/>
+          <w:rFonts w:ascii="Calibri" w:hAnsi="Calibri" w:cs="Calibri" w:eastAsiaTheme="minorEastAsia"/>
           <w:b/>
           <w:sz w:val="26"/>
           <w:szCs w:val="26"/>
@@ -41,7 +41,7 @@
       </w:r>
       <w:r>
         <w:rPr>
-          <w:rFonts w:ascii="Calibri" w:eastAsiaTheme="minorEastAsia" w:hAnsi="Calibri" w:cs="Calibri"/>
+          <w:rFonts w:ascii="Calibri" w:hAnsi="Calibri" w:cs="Calibri" w:eastAsiaTheme="minorEastAsia"/>
           <w:b/>
           <w:sz w:val="26"/>
           <w:szCs w:val="26"/>
@@ -52,7 +52,7 @@
       </w:r>
       <w:r>
         <w:rPr>
-          <w:rFonts w:ascii="Calibri" w:eastAsiaTheme="minorEastAsia" w:hAnsi="Calibri" w:cs="Calibri"/>
+          <w:rFonts w:ascii="Calibri" w:hAnsi="Calibri" w:cs="Calibri" w:eastAsiaTheme="minorEastAsia"/>
           <w:b/>
           <w:sz w:val="26"/>
           <w:szCs w:val="26"/>
@@ -63,7 +63,7 @@
       </w:r>
       <w:r>
         <w:rPr>
-          <w:rFonts w:ascii="Calibri" w:eastAsiaTheme="minorEastAsia" w:hAnsi="Calibri" w:cs="Calibri"/>
+          <w:rFonts w:ascii="Calibri" w:hAnsi="Calibri" w:cs="Calibri" w:eastAsiaTheme="minorEastAsia"/>
           <w:b/>
           <w:sz w:val="26"/>
           <w:szCs w:val="26"/>
@@ -74,7 +74,7 @@
       </w:r>
       <w:r>
         <w:rPr>
-          <w:rFonts w:ascii="Calibri" w:eastAsiaTheme="minorEastAsia" w:hAnsi="Calibri" w:cs="Calibri"/>
+          <w:rFonts w:ascii="Calibri" w:hAnsi="Calibri" w:cs="Calibri" w:eastAsiaTheme="minorEastAsia"/>
           <w:b/>
           <w:sz w:val="26"/>
           <w:szCs w:val="26"/>
@@ -85,7 +85,7 @@
       </w:r>
       <w:r>
         <w:rPr>
-          <w:rFonts w:ascii="Calibri" w:eastAsiaTheme="minorEastAsia" w:hAnsi="Calibri" w:cs="Calibri"/>
+          <w:rFonts w:ascii="Calibri" w:hAnsi="Calibri" w:cs="Calibri" w:eastAsiaTheme="minorEastAsia"/>
           <w:b/>
           <w:sz w:val="26"/>
           <w:szCs w:val="26"/>
@@ -100,10 +100,10 @@
         <w:tblpPr w:leftFromText="180" w:rightFromText="180" w:vertAnchor="text" w:horzAnchor="margin" w:tblpXSpec="center" w:tblpY="42"/>
         <w:tblW w:w="10339" w:type="dxa"/>
         <w:tblBorders>
-          <w:top w:val="single" w:sz="12" w:space="0" w:color="5B8C9C"/>
-          <w:left w:val="single" w:sz="12" w:space="0" w:color="5B8C9C"/>
-          <w:bottom w:val="single" w:sz="12" w:space="0" w:color="5B8C9C"/>
-          <w:right w:val="single" w:sz="12" w:space="0" w:color="5B8C9C"/>
+          <w:top w:val="single" w:color="5B8C9C" w:sz="12" w:space="0"/>
+          <w:left w:val="single" w:color="5B8C9C" w:sz="12" w:space="0"/>
+          <w:bottom w:val="single" w:color="5B8C9C" w:sz="12" w:space="0"/>
+          <w:right w:val="single" w:color="5B8C9C" w:sz="12" w:space="0"/>
         </w:tblBorders>
         <w:tblLook w:val="04A0" w:firstRow="1" w:lastRow="0" w:firstColumn="1" w:lastColumn="0" w:noHBand="0" w:noVBand="1"/>
       </w:tblPr>
@@ -121,8 +121,8 @@
           <w:tcPr>
             <w:tcW w:w="2595" w:type="dxa"/>
             <w:tcBorders>
-              <w:bottom w:val="single" w:sz="8" w:space="0" w:color="5B8C9C"/>
-              <w:right w:val="single" w:sz="8" w:space="0" w:color="5B8C9C"/>
+              <w:bottom w:val="single" w:color="5B8C9C" w:sz="8" w:space="0"/>
+              <w:right w:val="single" w:color="5B8C9C" w:sz="8" w:space="0"/>
             </w:tcBorders>
             <w:vAlign w:val="center"/>
           </w:tcPr>
@@ -152,10 +152,10 @@
           <w:tcPr>
             <w:tcW w:w="4140" w:type="dxa"/>
             <w:tcBorders>
-              <w:top w:val="single" w:sz="12" w:space="0" w:color="5B8C9C"/>
-              <w:left w:val="single" w:sz="8" w:space="0" w:color="5B8C9C"/>
-              <w:bottom w:val="single" w:sz="8" w:space="0" w:color="5B8C9C"/>
-              <w:right w:val="single" w:sz="8" w:space="0" w:color="5B8C9C"/>
+              <w:top w:val="single" w:color="5B8C9C" w:sz="12" w:space="0"/>
+              <w:left w:val="single" w:color="5B8C9C" w:sz="8" w:space="0"/>
+              <w:bottom w:val="single" w:color="5B8C9C" w:sz="8" w:space="0"/>
+              <w:right w:val="single" w:color="5B8C9C" w:sz="8" w:space="0"/>
             </w:tcBorders>
             <w:vAlign w:val="center"/>
           </w:tcPr>
@@ -193,10 +193,10 @@
           <w:tcPr>
             <w:tcW w:w="2160" w:type="dxa"/>
             <w:tcBorders>
-              <w:top w:val="single" w:sz="12" w:space="0" w:color="5B8C9C"/>
-              <w:left w:val="single" w:sz="8" w:space="0" w:color="5B8C9C"/>
-              <w:bottom w:val="single" w:sz="8" w:space="0" w:color="5B8C9C"/>
-              <w:right w:val="single" w:sz="8" w:space="0" w:color="5B8C9C"/>
+              <w:top w:val="single" w:color="5B8C9C" w:sz="12" w:space="0"/>
+              <w:left w:val="single" w:color="5B8C9C" w:sz="8" w:space="0"/>
+              <w:bottom w:val="single" w:color="5B8C9C" w:sz="8" w:space="0"/>
+              <w:right w:val="single" w:color="5B8C9C" w:sz="8" w:space="0"/>
             </w:tcBorders>
             <w:vAlign w:val="center"/>
           </w:tcPr>
@@ -224,9 +224,9 @@
           <w:tcPr>
             <w:tcW w:w="1444" w:type="dxa"/>
             <w:tcBorders>
-              <w:top w:val="single" w:sz="12" w:space="0" w:color="5B8C9C"/>
-              <w:left w:val="single" w:sz="8" w:space="0" w:color="5B8C9C"/>
-              <w:bottom w:val="single" w:sz="8" w:space="0" w:color="5B8C9C"/>
+              <w:top w:val="single" w:color="5B8C9C" w:sz="12" w:space="0"/>
+              <w:left w:val="single" w:color="5B8C9C" w:sz="8" w:space="0"/>
+              <w:bottom w:val="single" w:color="5B8C9C" w:sz="8" w:space="0"/>
             </w:tcBorders>
             <w:vAlign w:val="center"/>
           </w:tcPr>
@@ -281,9 +281,9 @@
           <w:tcPr>
             <w:tcW w:w="2595" w:type="dxa"/>
             <w:tcBorders>
-              <w:top w:val="single" w:sz="8" w:space="0" w:color="5B8C9C"/>
-              <w:bottom w:val="single" w:sz="8" w:space="0" w:color="5B8C9C"/>
-              <w:right w:val="single" w:sz="8" w:space="0" w:color="5B8C9C"/>
+              <w:top w:val="single" w:color="5B8C9C" w:sz="8" w:space="0"/>
+              <w:bottom w:val="single" w:color="5B8C9C" w:sz="8" w:space="0"/>
+              <w:right w:val="single" w:color="5B8C9C" w:sz="8" w:space="0"/>
             </w:tcBorders>
             <w:vAlign w:val="center"/>
           </w:tcPr>
@@ -312,9 +312,9 @@
             <w:tcW w:w="7744" w:type="dxa"/>
             <w:gridSpan w:val="3"/>
             <w:tcBorders>
-              <w:top w:val="single" w:sz="8" w:space="0" w:color="5B8C9C"/>
-              <w:left w:val="single" w:sz="8" w:space="0" w:color="5B8C9C"/>
-              <w:bottom w:val="single" w:sz="8" w:space="0" w:color="5B8C9C"/>
+              <w:top w:val="single" w:color="5B8C9C" w:sz="8" w:space="0"/>
+              <w:left w:val="single" w:color="5B8C9C" w:sz="8" w:space="0"/>
+              <w:bottom w:val="single" w:color="5B8C9C" w:sz="8" w:space="0"/>
             </w:tcBorders>
             <w:vAlign w:val="center"/>
           </w:tcPr>
@@ -358,9 +358,9 @@
           <w:tcPr>
             <w:tcW w:w="2595" w:type="dxa"/>
             <w:tcBorders>
-              <w:top w:val="single" w:sz="8" w:space="0" w:color="5B8C9C"/>
-              <w:bottom w:val="single" w:sz="8" w:space="0" w:color="5B8C9C"/>
-              <w:right w:val="single" w:sz="8" w:space="0" w:color="5B8C9C"/>
+              <w:top w:val="single" w:color="5B8C9C" w:sz="8" w:space="0"/>
+              <w:bottom w:val="single" w:color="5B8C9C" w:sz="8" w:space="0"/>
+              <w:right w:val="single" w:color="5B8C9C" w:sz="8" w:space="0"/>
             </w:tcBorders>
             <w:vAlign w:val="center"/>
           </w:tcPr>
@@ -389,9 +389,9 @@
             <w:tcW w:w="7744" w:type="dxa"/>
             <w:gridSpan w:val="3"/>
             <w:tcBorders>
-              <w:top w:val="single" w:sz="8" w:space="0" w:color="5B8C9C"/>
-              <w:left w:val="single" w:sz="8" w:space="0" w:color="5B8C9C"/>
-              <w:bottom w:val="single" w:sz="8" w:space="0" w:color="5B8C9C"/>
+              <w:top w:val="single" w:color="5B8C9C" w:sz="8" w:space="0"/>
+              <w:left w:val="single" w:color="5B8C9C" w:sz="8" w:space="0"/>
+              <w:bottom w:val="single" w:color="5B8C9C" w:sz="8" w:space="0"/>
             </w:tcBorders>
             <w:vAlign w:val="center"/>
           </w:tcPr>
@@ -434,9 +434,9 @@
           <w:tcPr>
             <w:tcW w:w="2595" w:type="dxa"/>
             <w:tcBorders>
-              <w:top w:val="single" w:sz="8" w:space="0" w:color="5B8C9C"/>
-              <w:bottom w:val="single" w:sz="8" w:space="0" w:color="5B8C9C"/>
-              <w:right w:val="single" w:sz="8" w:space="0" w:color="5B8C9C"/>
+              <w:top w:val="single" w:color="5B8C9C" w:sz="8" w:space="0"/>
+              <w:bottom w:val="single" w:color="5B8C9C" w:sz="8" w:space="0"/>
+              <w:right w:val="single" w:color="5B8C9C" w:sz="8" w:space="0"/>
             </w:tcBorders>
             <w:vAlign w:val="center"/>
           </w:tcPr>
@@ -464,10 +464,10 @@
           <w:tcPr>
             <w:tcW w:w="4140" w:type="dxa"/>
             <w:tcBorders>
-              <w:top w:val="single" w:sz="8" w:space="0" w:color="5B8C9C"/>
-              <w:left w:val="single" w:sz="8" w:space="0" w:color="5B8C9C"/>
-              <w:bottom w:val="single" w:sz="8" w:space="0" w:color="5B8C9C"/>
-              <w:right w:val="single" w:sz="8" w:space="0" w:color="5B8C9C"/>
+              <w:top w:val="single" w:color="5B8C9C" w:sz="8" w:space="0"/>
+              <w:left w:val="single" w:color="5B8C9C" w:sz="8" w:space="0"/>
+              <w:bottom w:val="single" w:color="5B8C9C" w:sz="8" w:space="0"/>
+              <w:right w:val="single" w:color="5B8C9C" w:sz="8" w:space="0"/>
             </w:tcBorders>
             <w:vAlign w:val="center"/>
           </w:tcPr>
@@ -505,10 +505,10 @@
           <w:tcPr>
             <w:tcW w:w="2160" w:type="dxa"/>
             <w:tcBorders>
-              <w:top w:val="single" w:sz="8" w:space="0" w:color="5B8C9C"/>
-              <w:left w:val="single" w:sz="8" w:space="0" w:color="5B8C9C"/>
-              <w:bottom w:val="single" w:sz="8" w:space="0" w:color="5B8C9C"/>
-              <w:right w:val="single" w:sz="8" w:space="0" w:color="5B8C9C"/>
+              <w:top w:val="single" w:color="5B8C9C" w:sz="8" w:space="0"/>
+              <w:left w:val="single" w:color="5B8C9C" w:sz="8" w:space="0"/>
+              <w:bottom w:val="single" w:color="5B8C9C" w:sz="8" w:space="0"/>
+              <w:right w:val="single" w:color="5B8C9C" w:sz="8" w:space="0"/>
             </w:tcBorders>
             <w:vAlign w:val="center"/>
           </w:tcPr>
@@ -554,9 +554,9 @@
           <w:tcPr>
             <w:tcW w:w="1444" w:type="dxa"/>
             <w:tcBorders>
-              <w:top w:val="single" w:sz="8" w:space="0" w:color="5B8C9C"/>
-              <w:left w:val="single" w:sz="8" w:space="0" w:color="5B8C9C"/>
-              <w:bottom w:val="single" w:sz="8" w:space="0" w:color="5B8C9C"/>
+              <w:top w:val="single" w:color="5B8C9C" w:sz="8" w:space="0"/>
+              <w:left w:val="single" w:color="5B8C9C" w:sz="8" w:space="0"/>
+              <w:bottom w:val="single" w:color="5B8C9C" w:sz="8" w:space="0"/>
             </w:tcBorders>
             <w:vAlign w:val="center"/>
           </w:tcPr>
@@ -599,9 +599,9 @@
           <w:tcPr>
             <w:tcW w:w="2595" w:type="dxa"/>
             <w:tcBorders>
-              <w:top w:val="single" w:sz="8" w:space="0" w:color="5B8C9C"/>
-              <w:bottom w:val="single" w:sz="8" w:space="0" w:color="5B8C9C"/>
-              <w:right w:val="single" w:sz="8" w:space="0" w:color="5B8C9C"/>
+              <w:top w:val="single" w:color="5B8C9C" w:sz="8" w:space="0"/>
+              <w:bottom w:val="single" w:color="5B8C9C" w:sz="8" w:space="0"/>
+              <w:right w:val="single" w:color="5B8C9C" w:sz="8" w:space="0"/>
             </w:tcBorders>
             <w:vAlign w:val="center"/>
           </w:tcPr>
@@ -629,10 +629,10 @@
           <w:tcPr>
             <w:tcW w:w="4140" w:type="dxa"/>
             <w:tcBorders>
-              <w:top w:val="single" w:sz="8" w:space="0" w:color="5B8C9C"/>
-              <w:left w:val="single" w:sz="8" w:space="0" w:color="5B8C9C"/>
-              <w:bottom w:val="single" w:sz="8" w:space="0" w:color="5B8C9C"/>
-              <w:right w:val="single" w:sz="8" w:space="0" w:color="5B8C9C"/>
+              <w:top w:val="single" w:color="5B8C9C" w:sz="8" w:space="0"/>
+              <w:left w:val="single" w:color="5B8C9C" w:sz="8" w:space="0"/>
+              <w:bottom w:val="single" w:color="5B8C9C" w:sz="8" w:space="0"/>
+              <w:right w:val="single" w:color="5B8C9C" w:sz="8" w:space="0"/>
             </w:tcBorders>
             <w:vAlign w:val="center"/>
           </w:tcPr>
@@ -658,10 +658,10 @@
           <w:tcPr>
             <w:tcW w:w="2160" w:type="dxa"/>
             <w:tcBorders>
-              <w:top w:val="single" w:sz="8" w:space="0" w:color="5B8C9C"/>
-              <w:left w:val="single" w:sz="8" w:space="0" w:color="5B8C9C"/>
-              <w:bottom w:val="single" w:sz="8" w:space="0" w:color="5B8C9C"/>
-              <w:right w:val="single" w:sz="8" w:space="0" w:color="5B8C9C"/>
+              <w:top w:val="single" w:color="5B8C9C" w:sz="8" w:space="0"/>
+              <w:left w:val="single" w:color="5B8C9C" w:sz="8" w:space="0"/>
+              <w:bottom w:val="single" w:color="5B8C9C" w:sz="8" w:space="0"/>
+              <w:right w:val="single" w:color="5B8C9C" w:sz="8" w:space="0"/>
             </w:tcBorders>
             <w:vAlign w:val="center"/>
           </w:tcPr>
@@ -689,9 +689,9 @@
           <w:tcPr>
             <w:tcW w:w="1444" w:type="dxa"/>
             <w:tcBorders>
-              <w:top w:val="single" w:sz="8" w:space="0" w:color="5B8C9C"/>
-              <w:left w:val="single" w:sz="8" w:space="0" w:color="5B8C9C"/>
-              <w:bottom w:val="single" w:sz="8" w:space="0" w:color="5B8C9C"/>
+              <w:top w:val="single" w:color="5B8C9C" w:sz="8" w:space="0"/>
+              <w:left w:val="single" w:color="5B8C9C" w:sz="8" w:space="0"/>
+              <w:bottom w:val="single" w:color="5B8C9C" w:sz="8" w:space="0"/>
             </w:tcBorders>
             <w:vAlign w:val="center"/>
           </w:tcPr>
@@ -734,9 +734,9 @@
           <w:tcPr>
             <w:tcW w:w="2595" w:type="dxa"/>
             <w:tcBorders>
-              <w:top w:val="single" w:sz="8" w:space="0" w:color="5B8C9C"/>
-              <w:bottom w:val="single" w:sz="8" w:space="0" w:color="5B8C9C"/>
-              <w:right w:val="single" w:sz="8" w:space="0" w:color="5B8C9C"/>
+              <w:top w:val="single" w:color="5B8C9C" w:sz="8" w:space="0"/>
+              <w:bottom w:val="single" w:color="5B8C9C" w:sz="8" w:space="0"/>
+              <w:right w:val="single" w:color="5B8C9C" w:sz="8" w:space="0"/>
             </w:tcBorders>
             <w:vAlign w:val="center"/>
           </w:tcPr>
@@ -765,9 +765,9 @@
             <w:tcW w:w="7744" w:type="dxa"/>
             <w:gridSpan w:val="3"/>
             <w:tcBorders>
-              <w:top w:val="single" w:sz="8" w:space="0" w:color="5B8C9C"/>
-              <w:left w:val="single" w:sz="8" w:space="0" w:color="5B8C9C"/>
-              <w:bottom w:val="single" w:sz="8" w:space="0" w:color="5B8C9C"/>
+              <w:top w:val="single" w:color="5B8C9C" w:sz="8" w:space="0"/>
+              <w:left w:val="single" w:color="5B8C9C" w:sz="8" w:space="0"/>
+              <w:bottom w:val="single" w:color="5B8C9C" w:sz="8" w:space="0"/>
             </w:tcBorders>
             <w:vAlign w:val="center"/>
           </w:tcPr>
@@ -804,9 +804,9 @@
           <w:tcPr>
             <w:tcW w:w="2595" w:type="dxa"/>
             <w:tcBorders>
-              <w:top w:val="single" w:sz="8" w:space="0" w:color="5B8C9C"/>
-              <w:bottom w:val="single" w:sz="8" w:space="0" w:color="5B8C9C"/>
-              <w:right w:val="single" w:sz="8" w:space="0" w:color="5B8C9C"/>
+              <w:top w:val="single" w:color="5B8C9C" w:sz="8" w:space="0"/>
+              <w:bottom w:val="single" w:color="5B8C9C" w:sz="8" w:space="0"/>
+              <w:right w:val="single" w:color="5B8C9C" w:sz="8" w:space="0"/>
             </w:tcBorders>
             <w:vAlign w:val="center"/>
           </w:tcPr>
@@ -853,9 +853,9 @@
             <w:tcW w:w="7744" w:type="dxa"/>
             <w:gridSpan w:val="3"/>
             <w:tcBorders>
-              <w:top w:val="single" w:sz="8" w:space="0" w:color="5B8C9C"/>
-              <w:left w:val="single" w:sz="8" w:space="0" w:color="5B8C9C"/>
-              <w:bottom w:val="single" w:sz="8" w:space="0" w:color="5B8C9C"/>
+              <w:top w:val="single" w:color="5B8C9C" w:sz="8" w:space="0"/>
+              <w:left w:val="single" w:color="5B8C9C" w:sz="8" w:space="0"/>
+              <w:bottom w:val="single" w:color="5B8C9C" w:sz="8" w:space="0"/>
             </w:tcBorders>
             <w:vAlign w:val="center"/>
           </w:tcPr>
@@ -892,8 +892,8 @@
           <w:tcPr>
             <w:tcW w:w="2595" w:type="dxa"/>
             <w:tcBorders>
-              <w:top w:val="single" w:sz="8" w:space="0" w:color="5B8C9C"/>
-              <w:right w:val="single" w:sz="8" w:space="0" w:color="5B8C9C"/>
+              <w:top w:val="single" w:color="5B8C9C" w:sz="8" w:space="0"/>
+              <w:right w:val="single" w:color="5B8C9C" w:sz="8" w:space="0"/>
             </w:tcBorders>
             <w:vAlign w:val="center"/>
           </w:tcPr>
@@ -940,9 +940,9 @@
             <w:tcW w:w="7744" w:type="dxa"/>
             <w:gridSpan w:val="3"/>
             <w:tcBorders>
-              <w:top w:val="single" w:sz="8" w:space="0" w:color="5B8C9C"/>
-              <w:left w:val="single" w:sz="8" w:space="0" w:color="5B8C9C"/>
-              <w:bottom w:val="single" w:sz="12" w:space="0" w:color="5B8C9C"/>
+              <w:top w:val="single" w:color="5B8C9C" w:sz="8" w:space="0"/>
+              <w:left w:val="single" w:color="5B8C9C" w:sz="8" w:space="0"/>
+              <w:bottom w:val="single" w:color="5B8C9C" w:sz="12" w:space="0"/>
             </w:tcBorders>
             <w:vAlign w:val="center"/>
           </w:tcPr>
@@ -978,7 +978,7 @@
         <w:ind w:left="-360"/>
         <w:jc w:val="both"/>
         <w:rPr>
-          <w:rFonts w:ascii="Calibri" w:eastAsiaTheme="minorEastAsia" w:hAnsi="Calibri" w:cs="Calibri"/>
+          <w:rFonts w:ascii="Calibri" w:hAnsi="Calibri" w:cs="Calibri" w:eastAsiaTheme="minorEastAsia"/>
           <w:b/>
           <w:sz w:val="25"/>
           <w:szCs w:val="25"/>
@@ -987,7 +987,7 @@
       </w:pPr>
       <w:r>
         <w:rPr>
-          <w:rFonts w:ascii="Calibri" w:eastAsiaTheme="minorEastAsia" w:hAnsi="Calibri" w:cs="Calibri"/>
+          <w:rFonts w:ascii="Calibri" w:hAnsi="Calibri" w:cs="Calibri" w:eastAsiaTheme="minorEastAsia"/>
           <w:b/>
           <w:sz w:val="25"/>
           <w:szCs w:val="25"/>
@@ -997,7 +997,7 @@
       </w:r>
       <w:r>
         <w:rPr>
-          <w:rFonts w:ascii="Calibri" w:eastAsiaTheme="minorEastAsia" w:hAnsi="Calibri" w:cs="Calibri"/>
+          <w:rFonts w:ascii="Calibri" w:hAnsi="Calibri" w:cs="Calibri" w:eastAsiaTheme="minorEastAsia"/>
           <w:b/>
           <w:sz w:val="25"/>
           <w:szCs w:val="25"/>
@@ -1007,7 +1007,7 @@
       </w:r>
       <w:r>
         <w:rPr>
-          <w:rFonts w:ascii="Calibri" w:eastAsiaTheme="minorEastAsia" w:hAnsi="Calibri" w:cs="Calibri"/>
+          <w:rFonts w:ascii="Calibri" w:hAnsi="Calibri" w:cs="Calibri" w:eastAsiaTheme="minorEastAsia"/>
           <w:b/>
           <w:sz w:val="25"/>
           <w:szCs w:val="25"/>
@@ -1017,7 +1017,7 @@
       </w:r>
       <w:r>
         <w:rPr>
-          <w:rFonts w:ascii="Calibri" w:eastAsiaTheme="minorEastAsia" w:hAnsi="Calibri" w:cs="Calibri"/>
+          <w:rFonts w:ascii="Calibri" w:hAnsi="Calibri" w:cs="Calibri" w:eastAsiaTheme="minorEastAsia"/>
           <w:b/>
           <w:sz w:val="25"/>
           <w:szCs w:val="25"/>
@@ -1027,7 +1027,7 @@
       </w:r>
       <w:r>
         <w:rPr>
-          <w:rFonts w:ascii="Calibri" w:eastAsiaTheme="minorEastAsia" w:hAnsi="Calibri" w:cs="Calibri"/>
+          <w:rFonts w:ascii="Calibri" w:hAnsi="Calibri" w:cs="Calibri" w:eastAsiaTheme="minorEastAsia"/>
           <w:b/>
           <w:sz w:val="25"/>
           <w:szCs w:val="25"/>
@@ -1037,7 +1037,7 @@
       </w:r>
       <w:r>
         <w:rPr>
-          <w:rFonts w:ascii="Calibri" w:eastAsiaTheme="minorEastAsia" w:hAnsi="Calibri" w:cs="Calibri"/>
+          <w:rFonts w:ascii="Calibri" w:hAnsi="Calibri" w:cs="Calibri" w:eastAsiaTheme="minorEastAsia"/>
           <w:b/>
           <w:sz w:val="25"/>
           <w:szCs w:val="25"/>
@@ -1047,7 +1047,7 @@
       </w:r>
       <w:r>
         <w:rPr>
-          <w:rFonts w:ascii="Calibri" w:eastAsiaTheme="minorEastAsia" w:hAnsi="Calibri" w:cs="Calibri"/>
+          <w:rFonts w:ascii="Calibri" w:hAnsi="Calibri" w:cs="Calibri" w:eastAsiaTheme="minorEastAsia"/>
           <w:b/>
           <w:sz w:val="25"/>
           <w:szCs w:val="25"/>
@@ -1084,7 +1084,7 @@
         <w:ind w:left="-360"/>
         <w:jc w:val="both"/>
         <w:rPr>
-          <w:rFonts w:ascii="Calibri" w:eastAsiaTheme="minorEastAsia" w:hAnsi="Calibri" w:cs="Calibri"/>
+          <w:rFonts w:ascii="Calibri" w:hAnsi="Calibri" w:cs="Calibri" w:eastAsiaTheme="minorEastAsia"/>
           <w:b/>
           <w:sz w:val="25"/>
           <w:szCs w:val="25"/>
@@ -1093,7 +1093,7 @@
       </w:pPr>
       <w:r>
         <w:rPr>
-          <w:rFonts w:ascii="Calibri" w:eastAsiaTheme="minorEastAsia" w:hAnsi="Calibri" w:cs="Calibri"/>
+          <w:rFonts w:ascii="Calibri" w:hAnsi="Calibri" w:cs="Calibri" w:eastAsiaTheme="minorEastAsia"/>
           <w:b/>
           <w:sz w:val="25"/>
           <w:szCs w:val="25"/>
@@ -1129,7 +1129,7 @@
         <w:ind w:left="-360"/>
         <w:jc w:val="both"/>
         <w:rPr>
-          <w:rFonts w:ascii="Calibri" w:eastAsiaTheme="minorEastAsia" w:hAnsi="Calibri" w:cs="Calibri"/>
+          <w:rFonts w:ascii="Calibri" w:hAnsi="Calibri" w:cs="Calibri" w:eastAsiaTheme="minorEastAsia"/>
           <w:b/>
           <w:sz w:val="25"/>
           <w:szCs w:val="25"/>
@@ -1138,7 +1138,7 @@
       </w:pPr>
       <w:r>
         <w:rPr>
-          <w:rFonts w:ascii="Calibri" w:eastAsiaTheme="minorEastAsia" w:hAnsi="Calibri" w:cs="Calibri"/>
+          <w:rFonts w:ascii="Calibri" w:hAnsi="Calibri" w:cs="Calibri" w:eastAsiaTheme="minorEastAsia"/>
           <w:b/>
           <w:sz w:val="25"/>
           <w:szCs w:val="25"/>
@@ -1148,7 +1148,7 @@
       </w:r>
       <w:r>
         <w:rPr>
-          <w:rFonts w:ascii="Calibri" w:eastAsiaTheme="minorEastAsia" w:hAnsi="Calibri" w:cs="Calibri"/>
+          <w:rFonts w:ascii="Calibri" w:hAnsi="Calibri" w:cs="Calibri" w:eastAsiaTheme="minorEastAsia"/>
           <w:b/>
           <w:sz w:val="25"/>
           <w:szCs w:val="25"/>
@@ -1158,7 +1158,7 @@
       </w:r>
       <w:r>
         <w:rPr>
-          <w:rFonts w:ascii="Calibri" w:eastAsiaTheme="minorEastAsia" w:hAnsi="Calibri" w:cs="Calibri"/>
+          <w:rFonts w:ascii="Calibri" w:hAnsi="Calibri" w:cs="Calibri" w:eastAsiaTheme="minorEastAsia"/>
           <w:b/>
           <w:sz w:val="25"/>
           <w:szCs w:val="25"/>
@@ -1168,7 +1168,7 @@
       </w:r>
       <w:r>
         <w:rPr>
-          <w:rFonts w:ascii="Calibri" w:eastAsiaTheme="minorEastAsia" w:hAnsi="Calibri" w:cs="Calibri"/>
+          <w:rFonts w:ascii="Calibri" w:hAnsi="Calibri" w:cs="Calibri" w:eastAsiaTheme="minorEastAsia"/>
           <w:b/>
           <w:sz w:val="25"/>
           <w:szCs w:val="25"/>
@@ -1178,7 +1178,7 @@
       </w:r>
       <w:r>
         <w:rPr>
-          <w:rFonts w:ascii="Calibri" w:eastAsiaTheme="minorEastAsia" w:hAnsi="Calibri" w:cs="Calibri"/>
+          <w:rFonts w:ascii="Calibri" w:hAnsi="Calibri" w:cs="Calibri" w:eastAsiaTheme="minorEastAsia"/>
           <w:b/>
           <w:sz w:val="25"/>
           <w:szCs w:val="25"/>
@@ -1214,7 +1214,7 @@
         <w:ind w:left="-360"/>
         <w:jc w:val="both"/>
         <w:rPr>
-          <w:rFonts w:ascii="Calibri" w:eastAsiaTheme="minorEastAsia" w:hAnsi="Calibri" w:cs="Calibri"/>
+          <w:rFonts w:ascii="Calibri" w:hAnsi="Calibri" w:cs="Calibri" w:eastAsiaTheme="minorEastAsia"/>
           <w:b/>
           <w:sz w:val="25"/>
           <w:szCs w:val="25"/>
@@ -1223,7 +1223,7 @@
       </w:pPr>
       <w:r>
         <w:rPr>
-          <w:rFonts w:ascii="Calibri" w:eastAsiaTheme="minorEastAsia" w:hAnsi="Calibri" w:cs="Calibri"/>
+          <w:rFonts w:ascii="Calibri" w:hAnsi="Calibri" w:cs="Calibri" w:eastAsiaTheme="minorEastAsia"/>
           <w:b/>
           <w:sz w:val="25"/>
           <w:szCs w:val="25"/>
@@ -1233,7 +1233,7 @@
       </w:r>
       <w:r>
         <w:rPr>
-          <w:rFonts w:ascii="Calibri" w:eastAsiaTheme="minorEastAsia" w:hAnsi="Calibri" w:cs="Calibri"/>
+          <w:rFonts w:ascii="Calibri" w:hAnsi="Calibri" w:cs="Calibri" w:eastAsiaTheme="minorEastAsia"/>
           <w:b/>
           <w:sz w:val="25"/>
           <w:szCs w:val="25"/>
@@ -1243,7 +1243,7 @@
       </w:r>
       <w:r>
         <w:rPr>
-          <w:rFonts w:ascii="Calibri" w:eastAsiaTheme="minorEastAsia" w:hAnsi="Calibri" w:cs="Calibri"/>
+          <w:rFonts w:ascii="Calibri" w:hAnsi="Calibri" w:cs="Calibri" w:eastAsiaTheme="minorEastAsia"/>
           <w:b/>
           <w:sz w:val="25"/>
           <w:szCs w:val="25"/>
@@ -1284,7 +1284,7 @@
         <w:ind w:left="-360"/>
         <w:jc w:val="both"/>
         <w:rPr>
-          <w:rFonts w:ascii="Calibri" w:eastAsiaTheme="minorEastAsia" w:hAnsi="Calibri" w:cs="Calibri"/>
+          <w:rFonts w:ascii="Calibri" w:hAnsi="Calibri" w:cs="Calibri" w:eastAsiaTheme="minorEastAsia"/>
           <w:b/>
           <w:sz w:val="25"/>
           <w:szCs w:val="25"/>
@@ -1293,7 +1293,7 @@
       </w:pPr>
       <w:r>
         <w:rPr>
-          <w:rFonts w:ascii="Calibri" w:eastAsiaTheme="minorEastAsia" w:hAnsi="Calibri" w:cs="Calibri"/>
+          <w:rFonts w:ascii="Calibri" w:hAnsi="Calibri" w:cs="Calibri" w:eastAsiaTheme="minorEastAsia"/>
           <w:b/>
           <w:sz w:val="25"/>
           <w:szCs w:val="25"/>
@@ -1450,6 +1450,232 @@
         <w:t>Reviewed By:</w:t>
       </w:r>
     </w:p>
+    <w:sdt>
+      <w:sdtPr>
+        <w:alias w:val="inspection.signature.inspector"/>
+        <w:tag w:val="inspection.signature.inspector"/>
+      </w:sdtPr>
+      <w:sdtContent>
+        <w:p>
+          <w:pPr>
+            <w:tabs>
+              <w:tab w:val="left" w:pos="5760"/>
+            </w:tabs>
+            <w:spacing w:after="0" w:line="240" w:lineRule="auto"/>
+            <w:ind w:left="-360"/>
+            <w:jc w:val="both"/>
+            <w:rPr>
+              <w:rFonts w:ascii="Calibri" w:hAnsi="Calibri" w:cs="Calibri"/>
+            </w:rPr>
+          </w:pPr>
+          <w:r>
+            <w:rPr>
+              <w:rFonts w:eastAsia="Calibri" w:cstheme="minorHAnsi"/>
+              <w:noProof/>
+              <w:sz w:val="16"/>
+              <w:szCs w:val="16"/>
+            </w:rPr>
+            <mc:AlternateContent>
+              <mc:Choice Requires="wps">
+                <w:drawing>
+                  <wp:inline distT="0" distB="0" distL="0" distR="0" wp14:anchorId="6F8FE4C5" wp14:editId="7E484097">
+                    <wp:extent cx="1828800" cy="457200"/>
+                    <wp:effectExtent l="0" t="0" r="0" b="0"/>
+                    <wp:docPr id="1825677346" name="Text Box 1825677346"/>
+                    <wp:cNvGraphicFramePr>
+                      <a:graphicFrameLocks xmlns:a="http://schemas.openxmlformats.org/drawingml/2006/main"/>
+                    </wp:cNvGraphicFramePr>
+                    <a:graphic xmlns:a="http://schemas.openxmlformats.org/drawingml/2006/main">
+                      <a:graphicData uri="http://schemas.microsoft.com/office/word/2010/wordprocessingShape">
+                        <wps:wsp>
+                          <wps:cNvSpPr txBox="1">
+                            <a:spLocks noChangeArrowheads="1"/>
+                          </wps:cNvSpPr>
+                          <wps:spPr bwMode="auto">
+                            <a:xfrm>
+                              <a:off x="0" y="0"/>
+                              <a:ext cx="1828800" cy="457200"/>
+                            </a:xfrm>
+                            <a:prstGeom prst="rect">
+                              <a:avLst/>
+                            </a:prstGeom>
+                            <a:blipFill>
+                              <a:blip r:embed="rId11"/>
+                              <a:stretch>
+                                <a:fillRect/>
+                              </a:stretch>
+                            </a:blipFill>
+                            <a:ln w="9525">
+                              <a:noFill/>
+                              <a:miter lim="800000"/>
+                              <a:headEnd/>
+                              <a:tailEnd/>
+                            </a:ln>
+                          </wps:spPr>
+                          <wps:txbx>
+                            <w:txbxContent>
+                              <w:p>
+                                <w:pPr>
+                                  <w:rPr>
+                                    <w:rFonts w:ascii="Verdana" w:hAnsi="Verdana"/>
+                                    <w:sz w:val="16"/>
+                                    <w:szCs w:val="18"/>
+                                  </w:rPr>
+                                </w:pPr>
+                              </w:p>
+                            </w:txbxContent>
+                          </wps:txbx>
+                          <wps:bodyPr rot="0" vert="horz" wrap="square" lIns="91440" tIns="45720" rIns="91440" bIns="45720" anchor="t" anchorCtr="0"/>
+                        </wps:wsp>
+                      </a:graphicData>
+                    </a:graphic>
+                  </wp:inline>
+                </w:drawing>
+              </mc:Choice>
+              <mc:Fallback>
+                <w:pict>
+                  <v:shapetype id="_x0000_t202" coordsize="21600,21600" o:spt="202" path="m,l,21600r21600,l21600,xe" w14:anchorId="6F8FE4C5">
+                    <v:stroke joinstyle="miter"/>
+                    <v:path gradientshapeok="t" o:connecttype="rect"/>
+                  </v:shapetype>
+                  <v:shape id="Text Box 1825677346" style="width:2in;height:36pt;visibility:visible;mso-wrap-style:square;mso-left-percent:-10001;mso-top-percent:-10001;mso-position-horizontal:absolute;mso-position-horizontal-relative:char;mso-position-vertical:absolute;mso-position-vertical-relative:line;mso-left-percent:-10001;mso-top-percent:-10001;v-text-anchor:top" o:spid="_x0000_s1026" stroked="f" type="#_x0000_t202" o:gfxdata="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">
+                    <v:fill type="frame" o:title="" recolor="t" rotate="t" r:id="rId12"/>
+                    <v:textbox>
+                      <w:txbxContent>
+                        <w:p>
+                          <w:pPr>
+                            <w:rPr>
+                              <w:rFonts w:ascii="Verdana" w:hAnsi="Verdana"/>
+                              <w:sz w:val="16"/>
+                              <w:szCs w:val="18"/>
+                            </w:rPr>
+                          </w:pPr>
+                        </w:p>
+                      </w:txbxContent>
+                    </v:textbox>
+                    <w10:anchorlock/>
+                  </v:shape>
+                </w:pict>
+              </mc:Fallback>
+            </mc:AlternateContent>
+          </w:r>
+          <w:r>
+            <w:rPr>
+              <w:rFonts w:ascii="Calibri" w:hAnsi="Calibri" w:cs="Calibri"/>
+            </w:rPr>
+            <w:tab/>
+          </w:r>
+        </w:p>
+      </w:sdtContent>
+    </w:sdt>
+    <w:sdt>
+      <w:sdtPr>
+        <w:alias w:val="inspection.signature.projectManager"/>
+        <w:tag w:val="inspection.signature.projectManager"/>
+      </w:sdtPr>
+      <w:sdtContent>
+        <w:p>
+          <w:pPr>
+            <w:tabs>
+              <w:tab w:val="left" w:pos="5760"/>
+            </w:tabs>
+            <w:spacing w:after="0" w:line="240" w:lineRule="auto"/>
+            <w:ind w:left="-360"/>
+            <w:jc w:val="both"/>
+            <w:rPr>
+              <w:rFonts w:ascii="Calibri" w:hAnsi="Calibri" w:cs="Calibri"/>
+            </w:rPr>
+          </w:pPr>
+          <w:r>
+            <w:rPr>
+              <w:rFonts w:eastAsia="Calibri" w:cstheme="minorHAnsi"/>
+              <w:noProof/>
+              <w:sz w:val="16"/>
+              <w:szCs w:val="16"/>
+            </w:rPr>
+            <mc:AlternateContent>
+              <mc:Choice Requires="wps">
+                <w:drawing>
+                  <wp:inline distT="0" distB="0" distL="0" distR="0" wp14:anchorId="34E2D7C5" wp14:editId="7D7C5E3B">
+                    <wp:extent cx="1828800" cy="457200"/>
+                    <wp:effectExtent l="0" t="0" r="0" b="0"/>
+                    <wp:docPr id="1869884412" name="Text Box 1869884412"/>
+                    <wp:cNvGraphicFramePr>
+                      <a:graphicFrameLocks xmlns:a="http://schemas.openxmlformats.org/drawingml/2006/main"/>
+                    </wp:cNvGraphicFramePr>
+                    <a:graphic xmlns:a="http://schemas.openxmlformats.org/drawingml/2006/main">
+                      <a:graphicData uri="http://schemas.microsoft.com/office/word/2010/wordprocessingShape">
+                        <wps:wsp>
+                          <wps:cNvSpPr txBox="1">
+                            <a:spLocks noChangeArrowheads="1"/>
+                          </wps:cNvSpPr>
+                          <wps:spPr bwMode="auto">
+                            <a:xfrm>
+                              <a:off x="0" y="0"/>
+                              <a:ext cx="1828800" cy="457200"/>
+                            </a:xfrm>
+                            <a:prstGeom prst="rect">
+                              <a:avLst/>
+                            </a:prstGeom>
+                            <a:blipFill>
+                              <a:blip r:embed="rId13"/>
+                              <a:stretch>
+                                <a:fillRect/>
+                              </a:stretch>
+                            </a:blipFill>
+                            <a:ln w="9525">
+                              <a:noFill/>
+                              <a:miter lim="800000"/>
+                              <a:headEnd/>
+                              <a:tailEnd/>
+                            </a:ln>
+                          </wps:spPr>
+                          <wps:txbx>
+                            <w:txbxContent>
+                              <w:p>
+                                <w:pPr>
+                                  <w:rPr>
+                                    <w:rFonts w:ascii="Verdana" w:hAnsi="Verdana"/>
+                                    <w:sz w:val="16"/>
+                                    <w:szCs w:val="18"/>
+                                  </w:rPr>
+                                </w:pPr>
+                              </w:p>
+                            </w:txbxContent>
+                          </wps:txbx>
+                          <wps:bodyPr rot="0" vert="horz" wrap="square" lIns="91440" tIns="45720" rIns="91440" bIns="45720" anchor="t" anchorCtr="0"/>
+                        </wps:wsp>
+                      </a:graphicData>
+                    </a:graphic>
+                  </wp:inline>
+                </w:drawing>
+              </mc:Choice>
+              <mc:Fallback>
+                <w:pict>
+                  <v:shape id="Text Box 1869884412" style="width:2in;height:36pt;visibility:visible;mso-wrap-style:square;mso-left-percent:-10001;mso-top-percent:-10001;mso-position-horizontal:absolute;mso-position-horizontal-relative:char;mso-position-vertical:absolute;mso-position-vertical-relative:line;mso-left-percent:-10001;mso-top-percent:-10001;v-text-anchor:top" o:spid="_x0000_s1027" stroked="f" type="#_x0000_t202" o:gfxdata="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" w14:anchorId="34E2D7C5">
+                    <v:fill type="frame" o:title="" recolor="t" rotate="t" r:id="rId14"/>
+                    <v:textbox>
+                      <w:txbxContent>
+                        <w:p>
+                          <w:pPr>
+                            <w:rPr>
+                              <w:rFonts w:ascii="Verdana" w:hAnsi="Verdana"/>
+                              <w:sz w:val="16"/>
+                              <w:szCs w:val="18"/>
+                            </w:rPr>
+                          </w:pPr>
+                        </w:p>
+                      </w:txbxContent>
+                    </v:textbox>
+                    <w10:anchorlock/>
+                  </v:shape>
+                </w:pict>
+              </mc:Fallback>
+            </mc:AlternateContent>
+          </w:r>
+        </w:p>
+      </w:sdtContent>
+    </w:sdt>
     <w:p>
       <w:pPr>
         <w:tabs>
@@ -1464,187 +1690,21 @@
       </w:pPr>
       <w:r>
         <w:rPr>
-          <w:rFonts w:eastAsia="Calibri" w:cstheme="minorHAnsi"/>
-          <w:noProof/>
-          <w:sz w:val="16"/>
-          <w:szCs w:val="16"/>
-        </w:rPr>
-        <mc:AlternateContent>
-          <mc:Choice Requires="wps">
-            <w:drawing>
-              <wp:inline distT="0" distB="0" distL="0" distR="0" wp14:anchorId="6F8FE4C5" wp14:editId="7E484097">
-                <wp:extent cx="1828800" cy="457200"/>
-                <wp:effectExtent l="0" t="0" r="0" b="0"/>
-                <wp:docPr id="1825677346" name="Text Box 1825677346"/>
-                <wp:cNvGraphicFramePr>
-                  <a:graphicFrameLocks xmlns:a="http://schemas.openxmlformats.org/drawingml/2006/main"/>
-                </wp:cNvGraphicFramePr>
-                <a:graphic xmlns:a="http://schemas.openxmlformats.org/drawingml/2006/main">
-                  <a:graphicData uri="http://schemas.microsoft.com/office/word/2010/wordprocessingShape">
-                    <wps:wsp>
-                      <wps:cNvSpPr txBox="1">
-                        <a:spLocks noChangeArrowheads="1"/>
-                      </wps:cNvSpPr>
-                      <wps:spPr bwMode="auto">
-                        <a:xfrm>
-                          <a:off x="0" y="0"/>
-                          <a:ext cx="1828800" cy="457200"/>
-                        </a:xfrm>
-                        <a:prstGeom prst="rect">
-                          <a:avLst/>
-                        </a:prstGeom>
-                        <a:blipFill>
-                          <a:blip r:embed="rId11"/>
-                          <a:stretch>
-                            <a:fillRect/>
-                          </a:stretch>
-                        </a:blipFill>
-                        <a:ln w="9525">
-                          <a:noFill/>
-                          <a:miter lim="800000"/>
-                          <a:headEnd/>
-                          <a:tailEnd/>
-                        </a:ln>
-                      </wps:spPr>
-                      <wps:txbx>
-                        <w:txbxContent>
-                          <w:p>
-                            <w:pPr>
-                              <w:rPr>
-                                <w:rFonts w:ascii="Verdana" w:hAnsi="Verdana"/>
-                                <w:sz w:val="16"/>
-                                <w:szCs w:val="18"/>
-                              </w:rPr>
-                            </w:pPr>
-                          </w:p>
-                        </w:txbxContent>
-                      </wps:txbx>
-                      <wps:bodyPr rot="0" vert="horz" wrap="square" lIns="91440" tIns="45720" rIns="91440" bIns="45720" anchor="t" anchorCtr="0"/>
-                    </wps:wsp>
-                  </a:graphicData>
-                </a:graphic>
-              </wp:inline>
-            </w:drawing>
-          </mc:Choice>
-          <mc:Fallback>
-            <w:pict>
-              <v:shapetype w14:anchorId="6F8FE4C5" id="_x0000_t202" coordsize="21600,21600" o:spt="202" path="m,l,21600r21600,l21600,xe">
-                <v:stroke joinstyle="miter"/>
-                <v:path gradientshapeok="t" o:connecttype="rect"/>
-              </v:shapetype>
-              <v:shape id="Text Box 1825677346" o:spid="_x0000_s1026" type="#_x0000_t202" style="width:2in;height:36pt;visibility:visible;mso-wrap-style:square;mso-left-percent:-10001;mso-top-percent:-10001;mso-position-horizontal:absolute;mso-position-horizontal-relative:char;mso-position-vertical:absolute;mso-position-vertical-relative:line;mso-left-percent:-10001;mso-top-percent:-10001;v-text-anchor:top" o:gfxdata="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" stroked="f">
-                <v:fill r:id="rId12" o:title="" recolor="t" rotate="t" type="frame"/>
-                <v:textbox>
-                  <w:txbxContent>
-                    <w:p>
-                      <w:pPr>
-                        <w:rPr>
-                          <w:rFonts w:ascii="Verdana" w:hAnsi="Verdana"/>
-                          <w:sz w:val="16"/>
-                          <w:szCs w:val="18"/>
-                        </w:rPr>
-                      </w:pPr>
-                    </w:p>
-                  </w:txbxContent>
-                </v:textbox>
-                <w10:anchorlock/>
-              </v:shape>
-            </w:pict>
-          </mc:Fallback>
-        </mc:AlternateContent>
-      </w:r>
-      <w:r>
-        <w:rPr>
           <w:rFonts w:ascii="Calibri" w:hAnsi="Calibri" w:cs="Calibri"/>
         </w:rPr>
+        <w:t>Anthony Wintergerst</w:t>
+      </w:r>
+      <w:r>
+        <w:rPr>
+          <w:rFonts w:ascii="Calibri" w:hAnsi="Calibri" w:cs="Calibri"/>
+        </w:rPr>
         <w:tab/>
       </w:r>
       <w:r>
         <w:rPr>
-          <w:rFonts w:eastAsia="Calibri" w:cstheme="minorHAnsi"/>
-          <w:noProof/>
-          <w:sz w:val="16"/>
-          <w:szCs w:val="16"/>
-        </w:rPr>
-        <mc:AlternateContent>
-          <mc:Choice Requires="wps">
-            <w:drawing>
-              <wp:inline distT="0" distB="0" distL="0" distR="0" wp14:anchorId="34E2D7C5" wp14:editId="7D7C5E3B">
-                <wp:extent cx="1828800" cy="457200"/>
-                <wp:effectExtent l="0" t="0" r="0" b="0"/>
-                <wp:docPr id="1869884412" name="Text Box 1869884412"/>
-                <wp:cNvGraphicFramePr>
-                  <a:graphicFrameLocks xmlns:a="http://schemas.openxmlformats.org/drawingml/2006/main"/>
-                </wp:cNvGraphicFramePr>
-                <a:graphic xmlns:a="http://schemas.openxmlformats.org/drawingml/2006/main">
-                  <a:graphicData uri="http://schemas.microsoft.com/office/word/2010/wordprocessingShape">
-                    <wps:wsp>
-                      <wps:cNvSpPr txBox="1">
-                        <a:spLocks noChangeArrowheads="1"/>
-                      </wps:cNvSpPr>
-                      <wps:spPr bwMode="auto">
-                        <a:xfrm>
-                          <a:off x="0" y="0"/>
-                          <a:ext cx="1828800" cy="457200"/>
-                        </a:xfrm>
-                        <a:prstGeom prst="rect">
-                          <a:avLst/>
-                        </a:prstGeom>
-                        <a:blipFill>
-                          <a:blip r:embed="rId13"/>
-                          <a:stretch>
-                            <a:fillRect/>
-                          </a:stretch>
-                        </a:blipFill>
-                        <a:ln w="9525">
-                          <a:noFill/>
-                          <a:miter lim="800000"/>
-                          <a:headEnd/>
-                          <a:tailEnd/>
-                        </a:ln>
-                      </wps:spPr>
-                      <wps:txbx>
-                        <w:txbxContent>
-                          <w:p>
-                            <w:pPr>
-                              <w:rPr>
-                                <w:rFonts w:ascii="Verdana" w:hAnsi="Verdana"/>
-                                <w:sz w:val="16"/>
-                                <w:szCs w:val="18"/>
-                              </w:rPr>
-                            </w:pPr>
-                          </w:p>
-                        </w:txbxContent>
-                      </wps:txbx>
-                      <wps:bodyPr rot="0" vert="horz" wrap="square" lIns="91440" tIns="45720" rIns="91440" bIns="45720" anchor="t" anchorCtr="0"/>
-                    </wps:wsp>
-                  </a:graphicData>
-                </a:graphic>
-              </wp:inline>
-            </w:drawing>
-          </mc:Choice>
-          <mc:Fallback>
-            <w:pict>
-              <v:shape w14:anchorId="34E2D7C5" id="Text Box 1869884412" o:spid="_x0000_s1027" type="#_x0000_t202" style="width:2in;height:36pt;visibility:visible;mso-wrap-style:square;mso-left-percent:-10001;mso-top-percent:-10001;mso-position-horizontal:absolute;mso-position-horizontal-relative:char;mso-position-vertical:absolute;mso-position-vertical-relative:line;mso-left-percent:-10001;mso-top-percent:-10001;v-text-anchor:top" o:gfxdata="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" stroked="f">
-                <v:fill r:id="rId14" o:title="" recolor="t" rotate="t" type="frame"/>
-                <v:textbox>
-                  <w:txbxContent>
-                    <w:p>
-                      <w:pPr>
-                        <w:rPr>
-                          <w:rFonts w:ascii="Verdana" w:hAnsi="Verdana"/>
-                          <w:sz w:val="16"/>
-                          <w:szCs w:val="18"/>
-                        </w:rPr>
-                      </w:pPr>
-                    </w:p>
-                  </w:txbxContent>
-                </v:textbox>
-                <w10:anchorlock/>
-              </v:shape>
-            </w:pict>
-          </mc:Fallback>
-        </mc:AlternateContent>
+          <w:rFonts w:ascii="Calibri" w:hAnsi="Calibri" w:cs="Calibri"/>
+        </w:rPr>
+        <w:t>Ben Zinninger, P.E.</w:t>
       </w:r>
     </w:p>
     <w:p>
@@ -1663,37 +1723,6 @@
         <w:rPr>
           <w:rFonts w:ascii="Calibri" w:hAnsi="Calibri" w:cs="Calibri"/>
         </w:rPr>
-        <w:t>Anthony Wintergerst</w:t>
-      </w:r>
-      <w:r>
-        <w:rPr>
-          <w:rFonts w:ascii="Calibri" w:hAnsi="Calibri" w:cs="Calibri"/>
-        </w:rPr>
-        <w:tab/>
-      </w:r>
-      <w:r>
-        <w:rPr>
-          <w:rFonts w:ascii="Calibri" w:hAnsi="Calibri" w:cs="Calibri"/>
-        </w:rPr>
-        <w:t>Ben Zinninger, P.E.</w:t>
-      </w:r>
-    </w:p>
-    <w:p>
-      <w:pPr>
-        <w:tabs>
-          <w:tab w:val="left" w:pos="5760"/>
-        </w:tabs>
-        <w:spacing w:after="0" w:line="240" w:lineRule="auto"/>
-        <w:ind w:left="-360"/>
-        <w:jc w:val="both"/>
-        <w:rPr>
-          <w:rFonts w:ascii="Calibri" w:hAnsi="Calibri" w:cs="Calibri"/>
-        </w:rPr>
-      </w:pPr>
-      <w:r>
-        <w:rPr>
-          <w:rFonts w:ascii="Calibri" w:hAnsi="Calibri" w:cs="Calibri"/>
-        </w:rPr>
         <w:t>Special Inspector</w:t>
       </w:r>
       <w:r>
@@ -1750,10 +1779,10 @@
     </w:p>
     <w:tbl>
       <w:tblPr>
-        <w:tblW w:type="auto" w:w="0"/>
+        <w:tblW w:w="0" w:type="auto"/>
         <w:jc w:val="center"/>
         <w:tblLayout w:type="fixed"/>
-        <w:tblLook w:firstColumn="1" w:firstRow="1" w:lastColumn="0" w:lastRow="0" w:noHBand="0" w:noVBand="1" w:val="04A0"/>
+        <w:tblLook w:val="04A0" w:firstRow="1" w:lastRow="0" w:firstColumn="1" w:lastColumn="0" w:noHBand="0" w:noVBand="1"/>
       </w:tblPr>
       <w:tblGrid>
         <w:gridCol w:w="9360"/>
@@ -1764,7 +1793,7 @@
         </w:trPr>
         <w:tc>
           <w:tcPr>
-            <w:tcW w:type="dxa" w:w="9360"/>
+            <w:tcW w:w="9360" w:type="dxa"/>
             <w:vAlign w:val="center"/>
             <w:tcMar>
               <w:top w:w="80" w:type="dxa"/>
@@ -1773,10 +1802,10 @@
               <w:end w:w="80" w:type="dxa"/>
             </w:tcMar>
             <w:tcBorders>
-              <w:top w:val="single" w:sz="8" w:space="0" w:color="5C92A0"/>
-              <w:left w:val="single" w:sz="8" w:space="0" w:color="5C92A0"/>
-              <w:right w:val="single" w:sz="8" w:space="0" w:color="5C92A0"/>
-              <w:bottom w:val="single" w:sz="8" w:space="0" w:color="5C92A0"/>
+              <w:top w:val="single" w:color="5C92A0" w:sz="8" w:space="0"/>
+              <w:left w:val="single" w:color="5C92A0" w:sz="8" w:space="0"/>
+              <w:right w:val="single" w:color="5C92A0" w:sz="8" w:space="0"/>
+              <w:bottom w:val="single" w:color="5C92A0" w:sz="8" w:space="0"/>
             </w:tcBorders>
           </w:tcPr>
           <w:p>
@@ -1815,7 +1844,7 @@
         </w:trPr>
         <w:tc>
           <w:tcPr>
-            <w:tcW w:type="dxa" w:w="9360"/>
+            <w:tcW w:w="9360" w:type="dxa"/>
             <w:vAlign w:val="center"/>
             <w:tcMar>
               <w:top w:w="60" w:type="dxa"/>
@@ -1824,9 +1853,9 @@
               <w:end w:w="60" w:type="dxa"/>
             </w:tcMar>
             <w:tcBorders>
-              <w:left w:val="single" w:sz="8" w:space="0" w:color="5C92A0"/>
-              <w:right w:val="single" w:sz="8" w:space="0" w:color="5C92A0"/>
-              <w:bottom w:val="single" w:sz="8" w:space="0" w:color="5C92A0"/>
+              <w:left w:val="single" w:color="5C92A0" w:sz="8" w:space="0"/>
+              <w:right w:val="single" w:color="5C92A0" w:sz="8" w:space="0"/>
+              <w:bottom w:val="single" w:color="5C92A0" w:sz="8" w:space="0"/>
               <w:top w:val="nil"/>
             </w:tcBorders>
           </w:tcPr>
@@ -1856,7 +1885,7 @@
         </w:trPr>
         <w:tc>
           <w:tcPr>
-            <w:tcW w:type="dxa" w:w="9360"/>
+            <w:tcW w:w="9360" w:type="dxa"/>
             <w:vAlign w:val="center"/>
             <w:tcMar>
               <w:top w:w="80" w:type="dxa"/>
@@ -1865,10 +1894,10 @@
               <w:end w:w="80" w:type="dxa"/>
             </w:tcMar>
             <w:tcBorders>
-              <w:top w:val="single" w:sz="8" w:space="0" w:color="5C92A0"/>
-              <w:left w:val="single" w:sz="8" w:space="0" w:color="5C92A0"/>
-              <w:right w:val="single" w:sz="8" w:space="0" w:color="5C92A0"/>
-              <w:bottom w:val="single" w:sz="8" w:space="0" w:color="5C92A0"/>
+              <w:top w:val="single" w:color="5C92A0" w:sz="8" w:space="0"/>
+              <w:left w:val="single" w:color="5C92A0" w:sz="8" w:space="0"/>
+              <w:right w:val="single" w:color="5C92A0" w:sz="8" w:space="0"/>
+              <w:bottom w:val="single" w:color="5C92A0" w:sz="8" w:space="0"/>
             </w:tcBorders>
           </w:tcPr>
           <w:p>
@@ -1907,7 +1936,7 @@
         </w:trPr>
         <w:tc>
           <w:tcPr>
-            <w:tcW w:type="dxa" w:w="9360"/>
+            <w:tcW w:w="9360" w:type="dxa"/>
             <w:vAlign w:val="center"/>
             <w:tcMar>
               <w:top w:w="60" w:type="dxa"/>
@@ -1916,9 +1945,9 @@
               <w:end w:w="60" w:type="dxa"/>
             </w:tcMar>
             <w:tcBorders>
-              <w:left w:val="single" w:sz="8" w:space="0" w:color="5C92A0"/>
-              <w:right w:val="single" w:sz="8" w:space="0" w:color="5C92A0"/>
-              <w:bottom w:val="single" w:sz="8" w:space="0" w:color="5C92A0"/>
+              <w:left w:val="single" w:color="5C92A0" w:sz="8" w:space="0"/>
+              <w:right w:val="single" w:color="5C92A0" w:sz="8" w:space="0"/>
+              <w:bottom w:val="single" w:color="5C92A0" w:sz="8" w:space="0"/>
               <w:top w:val="nil"/>
             </w:tcBorders>
           </w:tcPr>

</xml_diff>

<commit_message>
Update approved template with yyyy-mm-dd date format and repaired PM signature area
</commit_message>
<xml_diff>
--- a/templates/CEI_Base_Template_Refined.docx
+++ b/templates/CEI_Base_Template_Refined.docx
@@ -246,6 +246,7 @@
               </w:rPr>
               <w:t>{</w:t>
             </w:r>
+            <w:proofErr w:type="spellStart"/>
             <w:r>
               <w:rPr>
                 <w:rFonts w:ascii="Calibri" w:hAnsi="Calibri" w:cs="Calibri"/>
@@ -263,6 +264,27 @@
                 <w:rFonts w:ascii="Calibri" w:hAnsi="Calibri" w:cs="Calibri"/>
               </w:rPr>
               <w:t>date</w:t>
+            </w:r>
+            <w:proofErr w:type="spellEnd"/>
+            <w:r>
+              <w:rPr>
+                <w:rFonts w:ascii="Calibri" w:hAnsi="Calibri" w:cs="Calibri"/>
+              </w:rPr>
+              <w:t xml:space="preserve">; </w:t>
+            </w:r>
+            <w:proofErr w:type="spellStart"/>
+            <w:r>
+              <w:rPr>
+                <w:rFonts w:ascii="Calibri" w:hAnsi="Calibri" w:cs="Calibri"/>
+              </w:rPr>
+              <w:t>yyyy</w:t>
+            </w:r>
+            <w:proofErr w:type="spellEnd"/>
+            <w:r>
+              <w:rPr>
+                <w:rFonts w:ascii="Calibri" w:hAnsi="Calibri" w:cs="Calibri"/>
+              </w:rPr>
+              <w:t>-mm-dd</w:t>
             </w:r>
             <w:r>
               <w:rPr>
@@ -333,7 +355,14 @@
               <w:rPr>
                 <w:rFonts w:ascii="Calibri" w:hAnsi="Calibri" w:cs="Calibri"/>
               </w:rPr>
-              <w:t>{project</w:t>
+              <w:t>{</w:t>
+            </w:r>
+            <w:proofErr w:type="spellStart"/>
+            <w:r>
+              <w:rPr>
+                <w:rFonts w:ascii="Calibri" w:hAnsi="Calibri" w:cs="Calibri"/>
+              </w:rPr>
+              <w:t>project</w:t>
             </w:r>
             <w:r>
               <w:rPr>
@@ -345,7 +374,14 @@
               <w:rPr>
                 <w:rFonts w:ascii="Calibri" w:hAnsi="Calibri" w:cs="Calibri"/>
               </w:rPr>
-              <w:t>num}</w:t>
+              <w:t>num</w:t>
+            </w:r>
+            <w:proofErr w:type="spellEnd"/>
+            <w:r>
+              <w:rPr>
+                <w:rFonts w:ascii="Calibri" w:hAnsi="Calibri" w:cs="Calibri"/>
+              </w:rPr>
+              <w:t>}</w:t>
             </w:r>
           </w:p>
         </w:tc>
@@ -409,7 +445,14 @@
               <w:rPr>
                 <w:rFonts w:ascii="Calibri" w:hAnsi="Calibri" w:cs="Calibri"/>
               </w:rPr>
-              <w:t>{proj</w:t>
+              <w:t>{</w:t>
+            </w:r>
+            <w:proofErr w:type="spellStart"/>
+            <w:r>
+              <w:rPr>
+                <w:rFonts w:ascii="Calibri" w:hAnsi="Calibri" w:cs="Calibri"/>
+              </w:rPr>
+              <w:t>proj</w:t>
             </w:r>
             <w:r>
               <w:rPr>
@@ -417,6 +460,7 @@
               </w:rPr>
               <w:t>ect.owner</w:t>
             </w:r>
+            <w:proofErr w:type="spellEnd"/>
             <w:r>
               <w:rPr>
                 <w:rFonts w:ascii="Calibri" w:hAnsi="Calibri" w:cs="Calibri"/>
@@ -487,12 +531,14 @@
               </w:rPr>
               <w:t>{</w:t>
             </w:r>
+            <w:proofErr w:type="spellStart"/>
             <w:r>
               <w:rPr>
                 <w:rFonts w:ascii="Calibri" w:hAnsi="Calibri" w:cs="Calibri"/>
               </w:rPr>
               <w:t>project.contract</w:t>
             </w:r>
+            <w:proofErr w:type="spellEnd"/>
             <w:r>
               <w:rPr>
                 <w:rFonts w:ascii="Calibri" w:hAnsi="Calibri" w:cs="Calibri"/>
@@ -574,7 +620,14 @@
               <w:rPr>
                 <w:rFonts w:ascii="Calibri" w:hAnsi="Calibri" w:cs="Calibri"/>
               </w:rPr>
-              <w:t>{project.report</w:t>
+              <w:t>{</w:t>
+            </w:r>
+            <w:proofErr w:type="spellStart"/>
+            <w:r>
+              <w:rPr>
+                <w:rFonts w:ascii="Calibri" w:hAnsi="Calibri" w:cs="Calibri"/>
+              </w:rPr>
+              <w:t>project.report</w:t>
             </w:r>
             <w:r>
               <w:rPr>
@@ -582,6 +635,7 @@
               </w:rPr>
               <w:t>.temp</w:t>
             </w:r>
+            <w:proofErr w:type="spellEnd"/>
             <w:r>
               <w:rPr>
                 <w:rFonts w:ascii="Calibri" w:hAnsi="Calibri" w:cs="Calibri"/>
@@ -650,7 +704,21 @@
               <w:rPr>
                 <w:rFonts w:ascii="Calibri" w:hAnsi="Calibri" w:cs="Calibri"/>
               </w:rPr>
-              <w:t>{project.general}</w:t>
+              <w:t>{</w:t>
+            </w:r>
+            <w:proofErr w:type="spellStart"/>
+            <w:r>
+              <w:rPr>
+                <w:rFonts w:ascii="Calibri" w:hAnsi="Calibri" w:cs="Calibri"/>
+              </w:rPr>
+              <w:t>project.general</w:t>
+            </w:r>
+            <w:proofErr w:type="spellEnd"/>
+            <w:r>
+              <w:rPr>
+                <w:rFonts w:ascii="Calibri" w:hAnsi="Calibri" w:cs="Calibri"/>
+              </w:rPr>
+              <w:t>}</w:t>
             </w:r>
           </w:p>
         </w:tc>
@@ -711,12 +779,14 @@
               </w:rPr>
               <w:t>{</w:t>
             </w:r>
+            <w:proofErr w:type="spellStart"/>
             <w:r>
               <w:rPr>
                 <w:rFonts w:ascii="Calibri" w:hAnsi="Calibri" w:cs="Calibri"/>
               </w:rPr>
               <w:t>project.report.weather</w:t>
             </w:r>
+            <w:proofErr w:type="spellEnd"/>
             <w:r>
               <w:rPr>
                 <w:rFonts w:ascii="Calibri" w:hAnsi="Calibri" w:cs="Calibri"/>
@@ -785,13 +855,21 @@
               <w:rPr>
                 <w:rFonts w:ascii="Calibri" w:hAnsi="Calibri" w:cs="Calibri"/>
               </w:rPr>
-              <w:t>{project.report.</w:t>
-            </w:r>
-            <w:r>
-              <w:rPr>
-                <w:rFonts w:ascii="Calibri" w:hAnsi="Calibri" w:cs="Calibri"/>
-              </w:rPr>
-              <w:t>location}</w:t>
+              <w:t>{</w:t>
+            </w:r>
+            <w:proofErr w:type="spellStart"/>
+            <w:r>
+              <w:rPr>
+                <w:rFonts w:ascii="Calibri" w:hAnsi="Calibri" w:cs="Calibri"/>
+              </w:rPr>
+              <w:t>project.report.location</w:t>
+            </w:r>
+            <w:proofErr w:type="spellEnd"/>
+            <w:r>
+              <w:rPr>
+                <w:rFonts w:ascii="Calibri" w:hAnsi="Calibri" w:cs="Calibri"/>
+              </w:rPr>
+              <w:t>}</w:t>
             </w:r>
           </w:p>
         </w:tc>
@@ -873,13 +951,21 @@
               <w:rPr>
                 <w:rFonts w:ascii="Calibri" w:hAnsi="Calibri" w:cs="Calibri"/>
               </w:rPr>
-              <w:t>{project.report.</w:t>
-            </w:r>
-            <w:r>
-              <w:rPr>
-                <w:rFonts w:ascii="Calibri" w:hAnsi="Calibri" w:cs="Calibri"/>
-              </w:rPr>
-              <w:t>inspector}</w:t>
+              <w:t>{</w:t>
+            </w:r>
+            <w:proofErr w:type="spellStart"/>
+            <w:r>
+              <w:rPr>
+                <w:rFonts w:ascii="Calibri" w:hAnsi="Calibri" w:cs="Calibri"/>
+              </w:rPr>
+              <w:t>project.report.inspector</w:t>
+            </w:r>
+            <w:proofErr w:type="spellEnd"/>
+            <w:r>
+              <w:rPr>
+                <w:rFonts w:ascii="Calibri" w:hAnsi="Calibri" w:cs="Calibri"/>
+              </w:rPr>
+              <w:t>}</w:t>
             </w:r>
           </w:p>
         </w:tc>
@@ -960,13 +1046,27 @@
               <w:rPr>
                 <w:rFonts w:ascii="Calibri" w:hAnsi="Calibri" w:cs="Calibri"/>
               </w:rPr>
-              <w:t>{project.report.</w:t>
-            </w:r>
-            <w:r>
-              <w:rPr>
-                <w:rFonts w:ascii="Calibri" w:hAnsi="Calibri" w:cs="Calibri"/>
-              </w:rPr>
-              <w:t>personnel}</w:t>
+              <w:t>{</w:t>
+            </w:r>
+            <w:proofErr w:type="spellStart"/>
+            <w:r>
+              <w:rPr>
+                <w:rFonts w:ascii="Calibri" w:hAnsi="Calibri" w:cs="Calibri"/>
+              </w:rPr>
+              <w:t>project.report.</w:t>
+            </w:r>
+            <w:r>
+              <w:rPr>
+                <w:rFonts w:ascii="Calibri" w:hAnsi="Calibri" w:cs="Calibri"/>
+              </w:rPr>
+              <w:t>personnel</w:t>
+            </w:r>
+            <w:proofErr w:type="spellEnd"/>
+            <w:r>
+              <w:rPr>
+                <w:rFonts w:ascii="Calibri" w:hAnsi="Calibri" w:cs="Calibri"/>
+              </w:rPr>
+              <w:t>}</w:t>
             </w:r>
           </w:p>
         </w:tc>
@@ -1069,13 +1169,27 @@
         <w:rPr>
           <w:rFonts w:ascii="Calibri" w:hAnsi="Calibri" w:cs="Calibri"/>
         </w:rPr>
-        <w:t>{project.report.</w:t>
-      </w:r>
+        <w:t>{</w:t>
+      </w:r>
+      <w:proofErr w:type="spellStart"/>
       <w:r>
         <w:rPr>
           <w:rFonts w:ascii="Calibri" w:hAnsi="Calibri" w:cs="Calibri"/>
         </w:rPr>
-        <w:t>description}</w:t>
+        <w:t>project.report.</w:t>
+      </w:r>
+      <w:r>
+        <w:rPr>
+          <w:rFonts w:ascii="Calibri" w:hAnsi="Calibri" w:cs="Calibri"/>
+        </w:rPr>
+        <w:t>description</w:t>
+      </w:r>
+      <w:proofErr w:type="spellEnd"/>
+      <w:r>
+        <w:rPr>
+          <w:rFonts w:ascii="Calibri" w:hAnsi="Calibri" w:cs="Calibri"/>
+        </w:rPr>
+        <w:t>}</w:t>
       </w:r>
     </w:p>
     <w:p>
@@ -1114,13 +1228,21 @@
         <w:rPr>
           <w:rFonts w:ascii="Calibri" w:hAnsi="Calibri" w:cs="Calibri"/>
         </w:rPr>
-        <w:t>{project.report.</w:t>
-      </w:r>
+        <w:t>{</w:t>
+      </w:r>
+      <w:proofErr w:type="spellStart"/>
       <w:r>
         <w:rPr>
           <w:rFonts w:ascii="Calibri" w:hAnsi="Calibri" w:cs="Calibri"/>
         </w:rPr>
-        <w:t>drawing}</w:t>
+        <w:t>project.report.drawing</w:t>
+      </w:r>
+      <w:proofErr w:type="spellEnd"/>
+      <w:r>
+        <w:rPr>
+          <w:rFonts w:ascii="Calibri" w:hAnsi="Calibri" w:cs="Calibri"/>
+        </w:rPr>
+        <w:t>}</w:t>
       </w:r>
     </w:p>
     <w:p>
@@ -1199,13 +1321,21 @@
         <w:rPr>
           <w:rFonts w:ascii="Calibri" w:hAnsi="Calibri" w:cs="Calibri"/>
         </w:rPr>
-        <w:t>{project.report.</w:t>
-      </w:r>
+        <w:t>{</w:t>
+      </w:r>
+      <w:proofErr w:type="spellStart"/>
       <w:r>
         <w:rPr>
           <w:rFonts w:ascii="Calibri" w:hAnsi="Calibri" w:cs="Calibri"/>
         </w:rPr>
-        <w:t>observations}</w:t>
+        <w:t>project.report.observations</w:t>
+      </w:r>
+      <w:proofErr w:type="spellEnd"/>
+      <w:r>
+        <w:rPr>
+          <w:rFonts w:ascii="Calibri" w:hAnsi="Calibri" w:cs="Calibri"/>
+        </w:rPr>
+        <w:t>}</w:t>
       </w:r>
     </w:p>
     <w:p>
@@ -1265,17 +1395,21 @@
         <w:rPr>
           <w:rFonts w:ascii="Calibri" w:hAnsi="Calibri" w:cs="Calibri"/>
         </w:rPr>
-        <w:t>{project.report.new_discrepancies}</w:t>
-      </w:r>
+        <w:t>{</w:t>
+      </w:r>
+      <w:proofErr w:type="spellStart"/>
       <w:r>
         <w:rPr>
           <w:rFonts w:ascii="Calibri" w:hAnsi="Calibri" w:cs="Calibri"/>
         </w:rPr>
-      </w:r>
+        <w:t>project.report.new_discrepancies</w:t>
+      </w:r>
+      <w:proofErr w:type="spellEnd"/>
       <w:r>
         <w:rPr>
           <w:rFonts w:ascii="Calibri" w:hAnsi="Calibri" w:cs="Calibri"/>
         </w:rPr>
+        <w:t>}</w:t>
       </w:r>
     </w:p>
     <w:p>
@@ -1315,12 +1449,21 @@
         <w:rPr>
           <w:rFonts w:ascii="Calibri" w:hAnsi="Calibri" w:cs="Calibri"/>
         </w:rPr>
-        <w:t>{project.report.old_discrepancies}</w:t>
-      </w:r>
+        <w:t>{</w:t>
+      </w:r>
+      <w:proofErr w:type="spellStart"/>
       <w:r>
         <w:rPr>
           <w:rFonts w:ascii="Calibri" w:hAnsi="Calibri" w:cs="Calibri"/>
         </w:rPr>
+        <w:t>project.report.old_discrepancies</w:t>
+      </w:r>
+      <w:proofErr w:type="spellEnd"/>
+      <w:r>
+        <w:rPr>
+          <w:rFonts w:ascii="Calibri" w:hAnsi="Calibri" w:cs="Calibri"/>
+        </w:rPr>
+        <w:t>}</w:t>
       </w:r>
     </w:p>
     <w:p>
@@ -1454,6 +1597,7 @@
       <w:sdtPr>
         <w:alias w:val="inspection.signature.inspector"/>
         <w:tag w:val="inspection.signature.inspector"/>
+        <w:id w:val="-1481758205"/>
       </w:sdtPr>
       <w:sdtContent>
         <w:p>
@@ -1532,7 +1676,7 @@
                   </wp:inline>
                 </w:drawing>
               </mc:Choice>
-              <mc:Fallback>
+              <mc:Fallback xmlns:a="http://schemas.openxmlformats.org/drawingml/2006/main">
                 <w:pict>
                   <v:shapetype id="_x0000_t202" coordsize="21600,21600" o:spt="202" path="m,l,21600r21600,l21600,xe" w14:anchorId="6F8FE4C5">
                     <v:stroke joinstyle="miter"/>
@@ -1565,27 +1709,6 @@
             </w:rPr>
             <w:tab/>
           </w:r>
-        </w:p>
-      </w:sdtContent>
-    </w:sdt>
-    <w:sdt>
-      <w:sdtPr>
-        <w:alias w:val="inspection.signature.projectManager"/>
-        <w:tag w:val="inspection.signature.projectManager"/>
-      </w:sdtPr>
-      <w:sdtContent>
-        <w:p>
-          <w:pPr>
-            <w:tabs>
-              <w:tab w:val="left" w:pos="5760"/>
-            </w:tabs>
-            <w:spacing w:after="0" w:line="240" w:lineRule="auto"/>
-            <w:ind w:left="-360"/>
-            <w:jc w:val="both"/>
-            <w:rPr>
-              <w:rFonts w:ascii="Calibri" w:hAnsi="Calibri" w:cs="Calibri"/>
-            </w:rPr>
-          </w:pPr>
           <w:r>
             <w:rPr>
               <w:rFonts w:eastAsia="Calibri" w:cstheme="minorHAnsi"/>
@@ -1596,7 +1719,7 @@
             <mc:AlternateContent>
               <mc:Choice Requires="wps">
                 <w:drawing>
-                  <wp:inline distT="0" distB="0" distL="0" distR="0" wp14:anchorId="34E2D7C5" wp14:editId="7D7C5E3B">
+                  <wp:inline distT="0" distB="0" distL="0" distR="0" wp14:anchorId="3F141AB9" wp14:editId="0151F9A9">
                     <wp:extent cx="1828800" cy="457200"/>
                     <wp:effectExtent l="0" t="0" r="0" b="0"/>
                     <wp:docPr id="1869884412" name="Text Box 1869884412"/>
@@ -1652,7 +1775,222 @@
               </mc:Choice>
               <mc:Fallback>
                 <w:pict>
-                  <v:shape id="Text Box 1869884412" style="width:2in;height:36pt;visibility:visible;mso-wrap-style:square;mso-left-percent:-10001;mso-top-percent:-10001;mso-position-horizontal:absolute;mso-position-horizontal-relative:char;mso-position-vertical:absolute;mso-position-vertical-relative:line;mso-left-percent:-10001;mso-top-percent:-10001;v-text-anchor:top" o:spid="_x0000_s1027" stroked="f" type="#_x0000_t202" o:gfxdata="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" w14:anchorId="34E2D7C5">
+                  <v:shapetype id="_x0000_t202" coordsize="21600,21600" o:spt="202" path="m,l,21600r21600,l21600,xe" w14:anchorId="3F141AB9">
+                    <v:stroke joinstyle="miter"/>
+                    <v:path gradientshapeok="t" o:connecttype="rect"/>
+                  </v:shapetype>
+                  <v:shape id="Text Box 1869884412" style="width:2in;height:36pt;visibility:visible;mso-wrap-style:square;mso-left-percent:-10001;mso-top-percent:-10001;mso-position-horizontal:absolute;mso-position-horizontal-relative:char;mso-position-vertical:absolute;mso-position-vertical-relative:line;mso-left-percent:-10001;mso-top-percent:-10001;v-text-anchor:top" o:spid="_x0000_s1027" stroked="f" type="#_x0000_t202" o:gfxdata="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">
+                    <v:fill type="frame" o:title="" recolor="t" rotate="t" r:id="rId14"/>
+                    <v:textbox>
+                      <w:txbxContent>
+                        <w:p>
+                          <w:pPr>
+                            <w:rPr>
+                              <w:rFonts w:ascii="Verdana" w:hAnsi="Verdana"/>
+                              <w:sz w:val="16"/>
+                              <w:szCs w:val="18"/>
+                            </w:rPr>
+                          </w:pPr>
+                        </w:p>
+                      </w:txbxContent>
+                    </v:textbox>
+                    <w10:anchorlock/>
+                  </v:shape>
+                </w:pict>
+              </mc:Fallback>
+            </mc:AlternateContent>
+          </w:r>
+        </w:p>
+      </w:sdtContent>
+    </w:sdt>
+    <w:sdt>
+      <w:sdtPr>
+        <w:alias w:val="inspection.signature.projectManager"/>
+        <w:tag w:val="inspection.signature.projectManager"/>
+        <w:id w:val="162596117"/>
+        <w:showingPlcHdr/>
+      </w:sdtPr>
+      <w:sdtContent>
+        <w:p>
+          <w:pPr>
+            <w:tabs>
+              <w:tab w:val="left" w:pos="5760"/>
+            </w:tabs>
+            <w:spacing w:after="0" w:line="240" w:lineRule="auto"/>
+            <w:ind w:left="-360"/>
+            <w:jc w:val="both"/>
+            <w:rPr>
+              <w:rFonts w:ascii="Calibri" w:hAnsi="Calibri" w:cs="Calibri"/>
+            </w:rPr>
+          </w:pPr>
+          <w:r>
+            <w:rPr>
+              <w:rFonts w:eastAsia="Calibri" w:cstheme="minorHAnsi"/>
+              <w:noProof/>
+              <w:sz w:val="16"/>
+              <w:szCs w:val="16"/>
+            </w:rPr>
+            <mc:AlternateContent>
+              <mc:Choice Requires="wps">
+                <w:drawing>
+                  <wp:inline distT="0" distB="0" distL="0" distR="0" wp14:anchorId="6F8FE4C5" wp14:editId="7E484097">
+                    <wp:extent cx="1828800" cy="457200"/>
+                    <wp:effectExtent l="0" t="0" r="0" b="0"/>
+                    <wp:docPr id="1825677346" name="Text Box 1825677346"/>
+                    <wp:cNvGraphicFramePr>
+                      <a:graphicFrameLocks xmlns:a="http://schemas.openxmlformats.org/drawingml/2006/main"/>
+                    </wp:cNvGraphicFramePr>
+                    <a:graphic xmlns:a="http://schemas.openxmlformats.org/drawingml/2006/main">
+                      <a:graphicData uri="http://schemas.microsoft.com/office/word/2010/wordprocessingShape">
+                        <wps:wsp>
+                          <wps:cNvSpPr txBox="1">
+                            <a:spLocks noChangeArrowheads="1"/>
+                          </wps:cNvSpPr>
+                          <wps:spPr bwMode="auto">
+                            <a:xfrm>
+                              <a:off x="0" y="0"/>
+                              <a:ext cx="1828800" cy="457200"/>
+                            </a:xfrm>
+                            <a:prstGeom prst="rect">
+                              <a:avLst/>
+                            </a:prstGeom>
+                            <a:blipFill>
+                              <a:blip r:embed="R50fc6464ed0f40a7"/>
+                              <a:stretch>
+                                <a:fillRect/>
+                              </a:stretch>
+                            </a:blipFill>
+                            <a:ln w="9525">
+                              <a:noFill/>
+                              <a:miter lim="800000"/>
+                              <a:headEnd/>
+                              <a:tailEnd/>
+                            </a:ln>
+                          </wps:spPr>
+                          <wps:txbx>
+                            <w:txbxContent>
+                              <w:p>
+                                <w:pPr>
+                                  <w:rPr>
+                                    <w:rFonts w:ascii="Verdana" w:hAnsi="Verdana"/>
+                                    <w:sz w:val="16"/>
+                                    <w:szCs w:val="18"/>
+                                  </w:rPr>
+                                </w:pPr>
+                              </w:p>
+                            </w:txbxContent>
+                          </wps:txbx>
+                          <wps:bodyPr rot="0" vert="horz" wrap="square" lIns="91440" tIns="45720" rIns="91440" bIns="45720" anchor="t" anchorCtr="0"/>
+                        </wps:wsp>
+                      </a:graphicData>
+                    </a:graphic>
+                  </wp:inline>
+                </w:drawing>
+              </mc:Choice>
+              <mc:Fallback xmlns:a="http://schemas.openxmlformats.org/drawingml/2006/main">
+                <w:pict>
+                  <v:shapetype id="_x0000_t202" coordsize="21600,21600" o:spt="202" path="m,l,21600r21600,l21600,xe" w14:anchorId="6F8FE4C5">
+                    <v:stroke joinstyle="miter"/>
+                    <v:path gradientshapeok="t" o:connecttype="rect"/>
+                  </v:shapetype>
+                  <v:shape id="Text Box 1825677346" style="width:2in;height:36pt;visibility:visible;mso-wrap-style:square;mso-left-percent:-10001;mso-top-percent:-10001;mso-position-horizontal:absolute;mso-position-horizontal-relative:char;mso-position-vertical:absolute;mso-position-vertical-relative:line;mso-left-percent:-10001;mso-top-percent:-10001;v-text-anchor:top" o:spid="_x0000_s1026" stroked="f" type="#_x0000_t202" o:gfxdata="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">
+                    <v:fill type="frame" o:title="" recolor="t" rotate="t" r:id="rId12"/>
+                    <v:textbox>
+                      <w:txbxContent>
+                        <w:p>
+                          <w:pPr>
+                            <w:rPr>
+                              <w:rFonts w:ascii="Verdana" w:hAnsi="Verdana"/>
+                              <w:sz w:val="16"/>
+                              <w:szCs w:val="18"/>
+                            </w:rPr>
+                          </w:pPr>
+                        </w:p>
+                      </w:txbxContent>
+                    </v:textbox>
+                    <w10:anchorlock/>
+                  </v:shape>
+                </w:pict>
+              </mc:Fallback>
+            </mc:AlternateContent>
+          </w:r>
+          <w:r>
+            <w:rPr>
+              <w:rFonts w:ascii="Calibri" w:hAnsi="Calibri" w:cs="Calibri"/>
+            </w:rPr>
+            <w:tab/>
+          </w:r>
+          <w:r>
+            <w:rPr>
+              <w:rFonts w:eastAsia="Calibri" w:cstheme="minorHAnsi"/>
+              <w:noProof/>
+              <w:sz w:val="16"/>
+              <w:szCs w:val="16"/>
+            </w:rPr>
+            <mc:AlternateContent>
+              <mc:Choice Requires="wps">
+                <w:drawing>
+                  <wp:inline distT="0" distB="0" distL="0" distR="0" wp14:anchorId="3F141AB9" wp14:editId="0151F9A9">
+                    <wp:extent cx="1828800" cy="457200"/>
+                    <wp:effectExtent l="0" t="0" r="0" b="0"/>
+                    <wp:docPr id="1869884412" name="Text Box 1869884412"/>
+                    <wp:cNvGraphicFramePr>
+                      <a:graphicFrameLocks xmlns:a="http://schemas.openxmlformats.org/drawingml/2006/main"/>
+                    </wp:cNvGraphicFramePr>
+                    <a:graphic xmlns:a="http://schemas.openxmlformats.org/drawingml/2006/main">
+                      <a:graphicData uri="http://schemas.microsoft.com/office/word/2010/wordprocessingShape">
+                        <wps:wsp>
+                          <wps:cNvSpPr txBox="1">
+                            <a:spLocks noChangeArrowheads="1"/>
+                          </wps:cNvSpPr>
+                          <wps:spPr bwMode="auto">
+                            <a:xfrm>
+                              <a:off x="0" y="0"/>
+                              <a:ext cx="1828800" cy="457200"/>
+                            </a:xfrm>
+                            <a:prstGeom prst="rect">
+                              <a:avLst/>
+                            </a:prstGeom>
+                            <a:blipFill>
+                              <a:blip r:embed="Rbfbe2846fbea437c"/>
+                              <a:stretch>
+                                <a:fillRect/>
+                              </a:stretch>
+                            </a:blipFill>
+                            <a:ln w="9525">
+                              <a:noFill/>
+                              <a:miter lim="800000"/>
+                              <a:headEnd/>
+                              <a:tailEnd/>
+                            </a:ln>
+                          </wps:spPr>
+                          <wps:txbx>
+                            <w:txbxContent>
+                              <w:p>
+                                <w:pPr>
+                                  <w:rPr>
+                                    <w:rFonts w:ascii="Verdana" w:hAnsi="Verdana"/>
+                                    <w:sz w:val="16"/>
+                                    <w:szCs w:val="18"/>
+                                  </w:rPr>
+                                </w:pPr>
+                              </w:p>
+                            </w:txbxContent>
+                          </wps:txbx>
+                          <wps:bodyPr rot="0" vert="horz" wrap="square" lIns="91440" tIns="45720" rIns="91440" bIns="45720" anchor="t" anchorCtr="0"/>
+                        </wps:wsp>
+                      </a:graphicData>
+                    </a:graphic>
+                  </wp:inline>
+                </w:drawing>
+              </mc:Choice>
+              <mc:Fallback>
+                <w:pict>
+                  <v:shapetype id="_x0000_t202" coordsize="21600,21600" o:spt="202" path="m,l,21600r21600,l21600,xe" w14:anchorId="3F141AB9">
+                    <v:stroke joinstyle="miter"/>
+                    <v:path gradientshapeok="t" o:connecttype="rect"/>
+                  </v:shapetype>
+                  <v:shape id="Text Box 1869884412" style="width:2in;height:36pt;visibility:visible;mso-wrap-style:square;mso-left-percent:-10001;mso-top-percent:-10001;mso-position-horizontal:absolute;mso-position-horizontal-relative:char;mso-position-vertical:absolute;mso-position-vertical-relative:line;mso-left-percent:-10001;mso-top-percent:-10001;v-text-anchor:top" o:spid="_x0000_s1027" stroked="f" type="#_x0000_t202" o:gfxdata="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">
                     <v:fill type="frame" o:title="" recolor="t" rotate="t" r:id="rId14"/>
                     <v:textbox>
                       <w:txbxContent>
@@ -1774,6 +2112,7 @@
           <w:b/>
           <w:sz w:val="24"/>
         </w:rPr>
+        <w:lastRenderedPageBreak/>
         <w:t>PHOTO DOCUMENTATION</w:t>
       </w:r>
     </w:p>
@@ -1790,23 +2129,24 @@
       <w:tr>
         <w:trPr>
           <w:trHeight w:val="4824" w:hRule="exact"/>
+          <w:jc w:val="center"/>
         </w:trPr>
         <w:tc>
           <w:tcPr>
             <w:tcW w:w="9360" w:type="dxa"/>
-            <w:vAlign w:val="center"/>
-            <w:tcMar>
-              <w:top w:w="80" w:type="dxa"/>
-              <w:start w:w="80" w:type="dxa"/>
-              <w:bottom w:w="80" w:type="dxa"/>
-              <w:end w:w="80" w:type="dxa"/>
-            </w:tcMar>
             <w:tcBorders>
               <w:top w:val="single" w:color="5C92A0" w:sz="8" w:space="0"/>
               <w:left w:val="single" w:color="5C92A0" w:sz="8" w:space="0"/>
+              <w:bottom w:val="single" w:color="5C92A0" w:sz="8" w:space="0"/>
               <w:right w:val="single" w:color="5C92A0" w:sz="8" w:space="0"/>
-              <w:bottom w:val="single" w:color="5C92A0" w:sz="8" w:space="0"/>
             </w:tcBorders>
+            <w:tcMar>
+              <w:top w:w="80" w:type="dxa"/>
+              <w:left w:w="80" w:type="dxa"/>
+              <w:bottom w:w="80" w:type="dxa"/>
+              <w:right w:w="80" w:type="dxa"/>
+            </w:tcMar>
+            <w:vAlign w:val="center"/>
           </w:tcPr>
           <w:p>
             <w:pPr>
@@ -1817,9 +2157,24 @@
               <w:rPr>
                 <w:b/>
                 <w:color w:val="5A5A5A"/>
-                <w:sz w:val="22"/>
-              </w:rPr>
-              <w:t>{project.report.photos[1].image}</w:t>
+              </w:rPr>
+              <w:t>{</w:t>
+            </w:r>
+            <w:proofErr w:type="spellStart"/>
+            <w:r>
+              <w:rPr>
+                <w:b/>
+                <w:color w:val="5A5A5A"/>
+              </w:rPr>
+              <w:t>project.report.photos</w:t>
+            </w:r>
+            <w:proofErr w:type="spellEnd"/>
+            <w:r>
+              <w:rPr>
+                <w:b/>
+                <w:color w:val="5A5A5A"/>
+              </w:rPr>
+              <w:t>[1].image}</w:t>
             </w:r>
           </w:p>
           <w:p>
@@ -1840,41 +2195,66 @@
       </w:tr>
       <w:tr>
         <w:trPr>
-          <w:trHeight w:val="605" w:hRule="atLeast"/>
+          <w:trHeight w:val="605"/>
+          <w:jc w:val="center"/>
         </w:trPr>
         <w:tc>
           <w:tcPr>
             <w:tcW w:w="9360" w:type="dxa"/>
-            <w:vAlign w:val="center"/>
+            <w:tcBorders>
+              <w:top w:val="nil"/>
+              <w:left w:val="single" w:color="5C92A0" w:sz="8" w:space="0"/>
+              <w:bottom w:val="single" w:color="5C92A0" w:sz="8" w:space="0"/>
+              <w:right w:val="single" w:color="5C92A0" w:sz="8" w:space="0"/>
+            </w:tcBorders>
             <w:tcMar>
               <w:top w:w="60" w:type="dxa"/>
-              <w:start w:w="60" w:type="dxa"/>
+              <w:left w:w="60" w:type="dxa"/>
               <w:bottom w:w="60" w:type="dxa"/>
-              <w:end w:w="60" w:type="dxa"/>
+              <w:right w:w="60" w:type="dxa"/>
             </w:tcMar>
-            <w:tcBorders>
-              <w:left w:val="single" w:color="5C92A0" w:sz="8" w:space="0"/>
-              <w:right w:val="single" w:color="5C92A0" w:sz="8" w:space="0"/>
-              <w:bottom w:val="single" w:color="5C92A0" w:sz="8" w:space="0"/>
-              <w:top w:val="nil"/>
-            </w:tcBorders>
+            <w:vAlign w:val="center"/>
           </w:tcPr>
           <w:p>
             <w:pPr>
               <w:spacing w:after="0"/>
+              <w:jc w:val="center"/>
             </w:pPr>
             <w:r>
               <w:rPr>
                 <w:b/>
                 <w:sz w:val="18"/>
               </w:rPr>
-              <w:t xml:space="preserve">Photo 1: </w:t>
-            </w:r>
-            <w:r>
-              <w:rPr>
+              <w:t xml:space="preserve">Photo </w:t>
+            </w:r>
+            <w:proofErr w:type="gramStart"/>
+            <w:r>
+              <w:rPr>
+                <w:b/>
                 <w:sz w:val="18"/>
               </w:rPr>
-              <w:t>{project.report.photos[1].caption}</w:t>
+              <w:t xml:space="preserve">1: </w:t>
+            </w:r>
+            <w:r>
+              <w:rPr>
+                <w:sz w:val="18"/>
+              </w:rPr>
+              <w:t>{</w:t>
+            </w:r>
+            <w:proofErr w:type="spellStart"/>
+            <w:proofErr w:type="gramEnd"/>
+            <w:r>
+              <w:rPr>
+                <w:sz w:val="18"/>
+              </w:rPr>
+              <w:t>project.report.photos</w:t>
+            </w:r>
+            <w:proofErr w:type="spellEnd"/>
+            <w:r>
+              <w:rPr>
+                <w:sz w:val="18"/>
+              </w:rPr>
+              <w:t>[1].caption}</w:t>
             </w:r>
           </w:p>
         </w:tc>
@@ -1882,23 +2262,24 @@
       <w:tr>
         <w:trPr>
           <w:trHeight w:val="4824" w:hRule="exact"/>
+          <w:jc w:val="center"/>
         </w:trPr>
         <w:tc>
           <w:tcPr>
             <w:tcW w:w="9360" w:type="dxa"/>
-            <w:vAlign w:val="center"/>
-            <w:tcMar>
-              <w:top w:w="80" w:type="dxa"/>
-              <w:start w:w="80" w:type="dxa"/>
-              <w:bottom w:w="80" w:type="dxa"/>
-              <w:end w:w="80" w:type="dxa"/>
-            </w:tcMar>
             <w:tcBorders>
               <w:top w:val="single" w:color="5C92A0" w:sz="8" w:space="0"/>
               <w:left w:val="single" w:color="5C92A0" w:sz="8" w:space="0"/>
+              <w:bottom w:val="single" w:color="5C92A0" w:sz="8" w:space="0"/>
               <w:right w:val="single" w:color="5C92A0" w:sz="8" w:space="0"/>
-              <w:bottom w:val="single" w:color="5C92A0" w:sz="8" w:space="0"/>
             </w:tcBorders>
+            <w:tcMar>
+              <w:top w:w="80" w:type="dxa"/>
+              <w:left w:w="80" w:type="dxa"/>
+              <w:bottom w:w="80" w:type="dxa"/>
+              <w:right w:w="80" w:type="dxa"/>
+            </w:tcMar>
+            <w:vAlign w:val="center"/>
           </w:tcPr>
           <w:p>
             <w:pPr>
@@ -1909,9 +2290,40 @@
               <w:rPr>
                 <w:b/>
                 <w:color w:val="5A5A5A"/>
-                <w:sz w:val="22"/>
-              </w:rPr>
-              <w:t>{project.report.photos[2].image}</w:t>
+              </w:rPr>
+              <w:t>{</w:t>
+            </w:r>
+            <w:proofErr w:type="spellStart"/>
+            <w:r>
+              <w:rPr>
+                <w:b/>
+                <w:color w:val="5A5A5A"/>
+              </w:rPr>
+              <w:t>project.report.photos</w:t>
+            </w:r>
+            <w:proofErr w:type="spellEnd"/>
+            <w:r>
+              <w:rPr>
+                <w:b/>
+                <w:color w:val="5A5A5A"/>
+              </w:rPr>
+              <w:t>[</w:t>
+            </w:r>
+            <w:proofErr w:type="gramStart"/>
+            <w:r>
+              <w:rPr>
+                <w:b/>
+                <w:color w:val="5A5A5A"/>
+              </w:rPr>
+              <w:t>2].</w:t>
+            </w:r>
+            <w:proofErr w:type="gramEnd"/>
+            <w:r>
+              <w:rPr>
+                <w:b/>
+                <w:color w:val="5A5A5A"/>
+              </w:rPr>
+              <w:t>image}</w:t>
             </w:r>
           </w:p>
           <w:p>
@@ -1932,41 +2344,66 @@
       </w:tr>
       <w:tr>
         <w:trPr>
-          <w:trHeight w:val="605" w:hRule="atLeast"/>
+          <w:trHeight w:val="605"/>
+          <w:jc w:val="center"/>
         </w:trPr>
         <w:tc>
           <w:tcPr>
             <w:tcW w:w="9360" w:type="dxa"/>
-            <w:vAlign w:val="center"/>
+            <w:tcBorders>
+              <w:top w:val="nil"/>
+              <w:left w:val="single" w:color="5C92A0" w:sz="8" w:space="0"/>
+              <w:bottom w:val="single" w:color="5C92A0" w:sz="8" w:space="0"/>
+              <w:right w:val="single" w:color="5C92A0" w:sz="8" w:space="0"/>
+            </w:tcBorders>
             <w:tcMar>
               <w:top w:w="60" w:type="dxa"/>
-              <w:start w:w="60" w:type="dxa"/>
+              <w:left w:w="60" w:type="dxa"/>
               <w:bottom w:w="60" w:type="dxa"/>
-              <w:end w:w="60" w:type="dxa"/>
+              <w:right w:w="60" w:type="dxa"/>
             </w:tcMar>
-            <w:tcBorders>
-              <w:left w:val="single" w:color="5C92A0" w:sz="8" w:space="0"/>
-              <w:right w:val="single" w:color="5C92A0" w:sz="8" w:space="0"/>
-              <w:bottom w:val="single" w:color="5C92A0" w:sz="8" w:space="0"/>
-              <w:top w:val="nil"/>
-            </w:tcBorders>
+            <w:vAlign w:val="center"/>
           </w:tcPr>
           <w:p>
             <w:pPr>
               <w:spacing w:after="0"/>
+              <w:jc w:val="center"/>
             </w:pPr>
             <w:r>
               <w:rPr>
                 <w:b/>
                 <w:sz w:val="18"/>
               </w:rPr>
-              <w:t xml:space="preserve">Photo 2: </w:t>
-            </w:r>
-            <w:r>
-              <w:rPr>
+              <w:t xml:space="preserve">Photo </w:t>
+            </w:r>
+            <w:proofErr w:type="gramStart"/>
+            <w:r>
+              <w:rPr>
+                <w:b/>
                 <w:sz w:val="18"/>
               </w:rPr>
-              <w:t>{project.report.photos[2].caption}</w:t>
+              <w:t xml:space="preserve">2: </w:t>
+            </w:r>
+            <w:r>
+              <w:rPr>
+                <w:sz w:val="18"/>
+              </w:rPr>
+              <w:t>{</w:t>
+            </w:r>
+            <w:proofErr w:type="spellStart"/>
+            <w:proofErr w:type="gramEnd"/>
+            <w:r>
+              <w:rPr>
+                <w:sz w:val="18"/>
+              </w:rPr>
+              <w:t>project.report.photos</w:t>
+            </w:r>
+            <w:proofErr w:type="spellEnd"/>
+            <w:r>
+              <w:rPr>
+                <w:sz w:val="18"/>
+              </w:rPr>
+              <w:t>[2].caption}</w:t>
             </w:r>
           </w:p>
         </w:tc>
@@ -1983,8 +2420,26 @@
           <w:color w:val="6E6E6E"/>
           <w:sz w:val="14"/>
         </w:rPr>
-        <w:t>Repeat this photo page as needed; continue photo numbering sequentially.</w:t>
-      </w:r>
+        <w:t>{</w:t>
+      </w:r>
+      <w:r>
+        <w:rPr>
+          <w:i/>
+          <w:color w:val="6E6E6E"/>
+          <w:sz w:val="14"/>
+        </w:rPr>
+        <w:t xml:space="preserve">Repeat this photo page as needed; continue photo numbering </w:t>
+      </w:r>
+      <w:proofErr w:type="gramStart"/>
+      <w:r>
+        <w:rPr>
+          <w:i/>
+          <w:color w:val="6E6E6E"/>
+          <w:sz w:val="14"/>
+        </w:rPr>
+        <w:t>sequentially.}</w:t>
+      </w:r>
+      <w:proofErr w:type="gramEnd"/>
     </w:p>
     <w:sectPr>
       <w:headerReference w:type="default" r:id="rId15"/>
@@ -4111,7 +4566,15 @@
 </file>
 
 <file path=customXml/item1.xml><?xml version="1.0" encoding="utf-8"?>
-<b:Sources xmlns:b="http://schemas.openxmlformats.org/officeDocument/2006/bibliography" xmlns="http://schemas.openxmlformats.org/officeDocument/2006/bibliography" SelectedStyle="\APASixthEditionOfficeOnline.xsl" StyleName="APA" Version="6"/>
+<p:properties xmlns:p="http://schemas.microsoft.com/office/2006/metadata/properties" xmlns:xsi="http://www.w3.org/2001/XMLSchema-instance" xmlns:pc="http://schemas.microsoft.com/office/infopath/2007/PartnerControls">
+  <documentManagement>
+    <TaxCatchAll xmlns="5c437b3f-8d58-4024-b6fc-a6a48772d55b" xsi:nil="true"/>
+    <lcf76f155ced4ddcb4097134ff3c332f xmlns="199911ad-b69d-4d0a-a4ca-d432eed627dc">
+      <Terms xmlns="http://schemas.microsoft.com/office/infopath/2007/PartnerControls"/>
+    </lcf76f155ced4ddcb4097134ff3c332f>
+    <Time xmlns="199911ad-b69d-4d0a-a4ca-d432eed627dc" xsi:nil="true"/>
+  </documentManagement>
+</p:properties>
 </file>
 
 <file path=customXml/item2.xml><?xml version="1.0" encoding="utf-8"?>
@@ -4382,15 +4845,7 @@
 </file>
 
 <file path=customXml/item3.xml><?xml version="1.0" encoding="utf-8"?>
-<p:properties xmlns:p="http://schemas.microsoft.com/office/2006/metadata/properties" xmlns:xsi="http://www.w3.org/2001/XMLSchema-instance" xmlns:pc="http://schemas.microsoft.com/office/infopath/2007/PartnerControls">
-  <documentManagement>
-    <TaxCatchAll xmlns="5c437b3f-8d58-4024-b6fc-a6a48772d55b" xsi:nil="true"/>
-    <lcf76f155ced4ddcb4097134ff3c332f xmlns="199911ad-b69d-4d0a-a4ca-d432eed627dc">
-      <Terms xmlns="http://schemas.microsoft.com/office/infopath/2007/PartnerControls"/>
-    </lcf76f155ced4ddcb4097134ff3c332f>
-    <Time xmlns="199911ad-b69d-4d0a-a4ca-d432eed627dc" xsi:nil="true"/>
-  </documentManagement>
-</p:properties>
+<b:Sources xmlns:b="http://schemas.openxmlformats.org/officeDocument/2006/bibliography" xmlns="http://schemas.openxmlformats.org/officeDocument/2006/bibliography" SelectedStyle="\APASixthEditionOfficeOnline.xsl" StyleName="APA" Version="6"/>
 </file>
 
 <file path=customXml/item4.xml><?xml version="1.0" encoding="utf-8"?>
@@ -4403,9 +4858,12 @@
 </file>
 
 <file path=customXml/itemProps1.xml><?xml version="1.0" encoding="utf-8"?>
-<ds:datastoreItem xmlns:ds="http://schemas.openxmlformats.org/officeDocument/2006/customXml" ds:itemID="{339A0E10-9C07-445F-BF91-3789EB954560}">
+<ds:datastoreItem xmlns:ds="http://schemas.openxmlformats.org/officeDocument/2006/customXml" ds:itemID="{E2E52A54-0EBA-421C-B8FD-DAADDB43ED73}">
   <ds:schemaRefs>
-    <ds:schemaRef ds:uri="http://schemas.openxmlformats.org/officeDocument/2006/bibliography"/>
+    <ds:schemaRef ds:uri="http://schemas.microsoft.com/office/2006/metadata/properties"/>
+    <ds:schemaRef ds:uri="http://schemas.microsoft.com/office/infopath/2007/PartnerControls"/>
+    <ds:schemaRef ds:uri="5c437b3f-8d58-4024-b6fc-a6a48772d55b"/>
+    <ds:schemaRef ds:uri="199911ad-b69d-4d0a-a4ca-d432eed627dc"/>
   </ds:schemaRefs>
 </ds:datastoreItem>
 </file>
@@ -4430,12 +4888,9 @@
 </file>
 
 <file path=customXml/itemProps3.xml><?xml version="1.0" encoding="utf-8"?>
-<ds:datastoreItem xmlns:ds="http://schemas.openxmlformats.org/officeDocument/2006/customXml" ds:itemID="{E2E52A54-0EBA-421C-B8FD-DAADDB43ED73}">
+<ds:datastoreItem xmlns:ds="http://schemas.openxmlformats.org/officeDocument/2006/customXml" ds:itemID="{339A0E10-9C07-445F-BF91-3789EB954560}">
   <ds:schemaRefs>
-    <ds:schemaRef ds:uri="http://schemas.microsoft.com/office/2006/metadata/properties"/>
-    <ds:schemaRef ds:uri="http://schemas.microsoft.com/office/infopath/2007/PartnerControls"/>
-    <ds:schemaRef ds:uri="5c437b3f-8d58-4024-b6fc-a6a48772d55b"/>
-    <ds:schemaRef ds:uri="199911ad-b69d-4d0a-a4ca-d432eed627dc"/>
+    <ds:schemaRef ds:uri="http://schemas.openxmlformats.org/officeDocument/2006/bibliography"/>
   </ds:schemaRefs>
 </ds:datastoreItem>
 </file>

</xml_diff>

<commit_message>
Fix duplicate signatures in template and honor JPEG EXIF orientation
Template had two overlapping drawings per signature content control (one
stray PM image inside the inspector block and vice versa). Keep only the
correct drawing in each block and harden ReplaceSignatureImage to drop
duplicate signature drawings so reports always show a single inspector
(left) and single PM (right) signature.

Also honor JPEG EXIF orientation when reading image dimensions so portrait
photos no longer get stretched into landscape frames.
</commit_message>
<xml_diff>
--- a/templates/CEI_Base_Template_Refined.docx
+++ b/templates/CEI_Base_Template_Refined.docx
@@ -1709,97 +1709,6 @@
             </w:rPr>
             <w:tab/>
           </w:r>
-          <w:r>
-            <w:rPr>
-              <w:rFonts w:eastAsia="Calibri" w:cstheme="minorHAnsi"/>
-              <w:noProof/>
-              <w:sz w:val="16"/>
-              <w:szCs w:val="16"/>
-            </w:rPr>
-            <mc:AlternateContent>
-              <mc:Choice Requires="wps">
-                <w:drawing>
-                  <wp:inline distT="0" distB="0" distL="0" distR="0" wp14:anchorId="3F141AB9" wp14:editId="0151F9A9">
-                    <wp:extent cx="1828800" cy="457200"/>
-                    <wp:effectExtent l="0" t="0" r="0" b="0"/>
-                    <wp:docPr id="1869884412" name="Text Box 1869884412"/>
-                    <wp:cNvGraphicFramePr>
-                      <a:graphicFrameLocks xmlns:a="http://schemas.openxmlformats.org/drawingml/2006/main"/>
-                    </wp:cNvGraphicFramePr>
-                    <a:graphic xmlns:a="http://schemas.openxmlformats.org/drawingml/2006/main">
-                      <a:graphicData uri="http://schemas.microsoft.com/office/word/2010/wordprocessingShape">
-                        <wps:wsp>
-                          <wps:cNvSpPr txBox="1">
-                            <a:spLocks noChangeArrowheads="1"/>
-                          </wps:cNvSpPr>
-                          <wps:spPr bwMode="auto">
-                            <a:xfrm>
-                              <a:off x="0" y="0"/>
-                              <a:ext cx="1828800" cy="457200"/>
-                            </a:xfrm>
-                            <a:prstGeom prst="rect">
-                              <a:avLst/>
-                            </a:prstGeom>
-                            <a:blipFill>
-                              <a:blip r:embed="rId13"/>
-                              <a:stretch>
-                                <a:fillRect/>
-                              </a:stretch>
-                            </a:blipFill>
-                            <a:ln w="9525">
-                              <a:noFill/>
-                              <a:miter lim="800000"/>
-                              <a:headEnd/>
-                              <a:tailEnd/>
-                            </a:ln>
-                          </wps:spPr>
-                          <wps:txbx>
-                            <w:txbxContent>
-                              <w:p>
-                                <w:pPr>
-                                  <w:rPr>
-                                    <w:rFonts w:ascii="Verdana" w:hAnsi="Verdana"/>
-                                    <w:sz w:val="16"/>
-                                    <w:szCs w:val="18"/>
-                                  </w:rPr>
-                                </w:pPr>
-                              </w:p>
-                            </w:txbxContent>
-                          </wps:txbx>
-                          <wps:bodyPr rot="0" vert="horz" wrap="square" lIns="91440" tIns="45720" rIns="91440" bIns="45720" anchor="t" anchorCtr="0"/>
-                        </wps:wsp>
-                      </a:graphicData>
-                    </a:graphic>
-                  </wp:inline>
-                </w:drawing>
-              </mc:Choice>
-              <mc:Fallback>
-                <w:pict>
-                  <v:shapetype id="_x0000_t202" coordsize="21600,21600" o:spt="202" path="m,l,21600r21600,l21600,xe" w14:anchorId="3F141AB9">
-                    <v:stroke joinstyle="miter"/>
-                    <v:path gradientshapeok="t" o:connecttype="rect"/>
-                  </v:shapetype>
-                  <v:shape id="Text Box 1869884412" style="width:2in;height:36pt;visibility:visible;mso-wrap-style:square;mso-left-percent:-10001;mso-top-percent:-10001;mso-position-horizontal:absolute;mso-position-horizontal-relative:char;mso-position-vertical:absolute;mso-position-vertical-relative:line;mso-left-percent:-10001;mso-top-percent:-10001;v-text-anchor:top" o:spid="_x0000_s1027" stroked="f" type="#_x0000_t202" o:gfxdata="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">
-                    <v:fill type="frame" o:title="" recolor="t" rotate="t" r:id="rId14"/>
-                    <v:textbox>
-                      <w:txbxContent>
-                        <w:p>
-                          <w:pPr>
-                            <w:rPr>
-                              <w:rFonts w:ascii="Verdana" w:hAnsi="Verdana"/>
-                              <w:sz w:val="16"/>
-                              <w:szCs w:val="18"/>
-                            </w:rPr>
-                          </w:pPr>
-                        </w:p>
-                      </w:txbxContent>
-                    </v:textbox>
-                    <w10:anchorlock/>
-                  </v:shape>
-                </w:pict>
-              </mc:Fallback>
-            </mc:AlternateContent>
-          </w:r>
         </w:p>
       </w:sdtContent>
     </w:sdt>
@@ -1823,97 +1732,6 @@
               <w:rFonts w:ascii="Calibri" w:hAnsi="Calibri" w:cs="Calibri"/>
             </w:rPr>
           </w:pPr>
-          <w:r>
-            <w:rPr>
-              <w:rFonts w:eastAsia="Calibri" w:cstheme="minorHAnsi"/>
-              <w:noProof/>
-              <w:sz w:val="16"/>
-              <w:szCs w:val="16"/>
-            </w:rPr>
-            <mc:AlternateContent>
-              <mc:Choice Requires="wps">
-                <w:drawing>
-                  <wp:inline distT="0" distB="0" distL="0" distR="0" wp14:anchorId="6F8FE4C5" wp14:editId="7E484097">
-                    <wp:extent cx="1828800" cy="457200"/>
-                    <wp:effectExtent l="0" t="0" r="0" b="0"/>
-                    <wp:docPr id="1825677346" name="Text Box 1825677346"/>
-                    <wp:cNvGraphicFramePr>
-                      <a:graphicFrameLocks xmlns:a="http://schemas.openxmlformats.org/drawingml/2006/main"/>
-                    </wp:cNvGraphicFramePr>
-                    <a:graphic xmlns:a="http://schemas.openxmlformats.org/drawingml/2006/main">
-                      <a:graphicData uri="http://schemas.microsoft.com/office/word/2010/wordprocessingShape">
-                        <wps:wsp>
-                          <wps:cNvSpPr txBox="1">
-                            <a:spLocks noChangeArrowheads="1"/>
-                          </wps:cNvSpPr>
-                          <wps:spPr bwMode="auto">
-                            <a:xfrm>
-                              <a:off x="0" y="0"/>
-                              <a:ext cx="1828800" cy="457200"/>
-                            </a:xfrm>
-                            <a:prstGeom prst="rect">
-                              <a:avLst/>
-                            </a:prstGeom>
-                            <a:blipFill>
-                              <a:blip r:embed="R50fc6464ed0f40a7"/>
-                              <a:stretch>
-                                <a:fillRect/>
-                              </a:stretch>
-                            </a:blipFill>
-                            <a:ln w="9525">
-                              <a:noFill/>
-                              <a:miter lim="800000"/>
-                              <a:headEnd/>
-                              <a:tailEnd/>
-                            </a:ln>
-                          </wps:spPr>
-                          <wps:txbx>
-                            <w:txbxContent>
-                              <w:p>
-                                <w:pPr>
-                                  <w:rPr>
-                                    <w:rFonts w:ascii="Verdana" w:hAnsi="Verdana"/>
-                                    <w:sz w:val="16"/>
-                                    <w:szCs w:val="18"/>
-                                  </w:rPr>
-                                </w:pPr>
-                              </w:p>
-                            </w:txbxContent>
-                          </wps:txbx>
-                          <wps:bodyPr rot="0" vert="horz" wrap="square" lIns="91440" tIns="45720" rIns="91440" bIns="45720" anchor="t" anchorCtr="0"/>
-                        </wps:wsp>
-                      </a:graphicData>
-                    </a:graphic>
-                  </wp:inline>
-                </w:drawing>
-              </mc:Choice>
-              <mc:Fallback xmlns:a="http://schemas.openxmlformats.org/drawingml/2006/main">
-                <w:pict>
-                  <v:shapetype id="_x0000_t202" coordsize="21600,21600" o:spt="202" path="m,l,21600r21600,l21600,xe" w14:anchorId="6F8FE4C5">
-                    <v:stroke joinstyle="miter"/>
-                    <v:path gradientshapeok="t" o:connecttype="rect"/>
-                  </v:shapetype>
-                  <v:shape id="Text Box 1825677346" style="width:2in;height:36pt;visibility:visible;mso-wrap-style:square;mso-left-percent:-10001;mso-top-percent:-10001;mso-position-horizontal:absolute;mso-position-horizontal-relative:char;mso-position-vertical:absolute;mso-position-vertical-relative:line;mso-left-percent:-10001;mso-top-percent:-10001;v-text-anchor:top" o:spid="_x0000_s1026" stroked="f" type="#_x0000_t202" o:gfxdata="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">
-                    <v:fill type="frame" o:title="" recolor="t" rotate="t" r:id="rId12"/>
-                    <v:textbox>
-                      <w:txbxContent>
-                        <w:p>
-                          <w:pPr>
-                            <w:rPr>
-                              <w:rFonts w:ascii="Verdana" w:hAnsi="Verdana"/>
-                              <w:sz w:val="16"/>
-                              <w:szCs w:val="18"/>
-                            </w:rPr>
-                          </w:pPr>
-                        </w:p>
-                      </w:txbxContent>
-                    </v:textbox>
-                    <w10:anchorlock/>
-                  </v:shape>
-                </w:pict>
-              </mc:Fallback>
-            </mc:AlternateContent>
-          </w:r>
           <w:r>
             <w:rPr>
               <w:rFonts w:ascii="Calibri" w:hAnsi="Calibri" w:cs="Calibri"/>

</xml_diff>

<commit_message>
Benchmark review: stabilize generation lifecycle and data hygiene
</commit_message>
<xml_diff>
--- a/templates/CEI_Base_Template_Refined.docx
+++ b/templates/CEI_Base_Template_Refined.docx
@@ -1,6 +1,6 @@
 
 <file path=word/document.xml><?xml version="1.0" encoding="utf-8"?>
-<w:document xmlns:a="http://schemas.openxmlformats.org/drawingml/2006/main" xmlns:wpc="http://schemas.microsoft.com/office/word/2010/wordprocessingCanvas" xmlns:cx="http://schemas.microsoft.com/office/drawing/2014/chartex" xmlns:cx1="http://schemas.microsoft.com/office/drawing/2015/9/8/chartex" xmlns:cx2="http://schemas.microsoft.com/office/drawing/2015/10/21/chartex" xmlns:cx3="http://schemas.microsoft.com/office/drawing/2016/5/9/chartex" xmlns:cx4="http://schemas.microsoft.com/office/drawing/2016/5/10/chartex" xmlns:cx5="http://schemas.microsoft.com/office/drawing/2016/5/11/chartex" xmlns:cx6="http://schemas.microsoft.com/office/drawing/2016/5/12/chartex" xmlns:cx7="http://schemas.microsoft.com/office/drawing/2016/5/13/chartex" xmlns:cx8="http://schemas.microsoft.com/office/drawing/2016/5/14/chartex" xmlns:mc="http://schemas.openxmlformats.org/markup-compatibility/2006" xmlns:aink="http://schemas.microsoft.com/office/drawing/2016/ink" xmlns:am3d="http://schemas.microsoft.com/office/drawing/2017/model3d" xmlns:o="urn:schemas-microsoft-com:office:office" xmlns:oel="http://schemas.microsoft.com/office/2019/extlst" xmlns:r="http://schemas.openxmlformats.org/officeDocument/2006/relationships" xmlns:m="http://schemas.openxmlformats.org/officeDocument/2006/math" xmlns:v="urn:schemas-microsoft-com:vml" xmlns:wp14="http://schemas.microsoft.com/office/word/2010/wordprocessingDrawing" xmlns:wp="http://schemas.openxmlformats.org/drawingml/2006/wordprocessingDrawing" xmlns:w10="urn:schemas-microsoft-com:office:word" xmlns:w="http://schemas.openxmlformats.org/wordprocessingml/2006/main" xmlns:w14="http://schemas.microsoft.com/office/word/2010/wordml" xmlns:w15="http://schemas.microsoft.com/office/word/2012/wordml" xmlns:w16cex="http://schemas.microsoft.com/office/word/2018/wordml/cex" xmlns:w16cid="http://schemas.microsoft.com/office/word/2016/wordml/cid" xmlns:w16="http://schemas.microsoft.com/office/word/2018/wordml" xmlns:w16du="http://schemas.microsoft.com/office/word/2023/wordml/word16du" xmlns:w16sdtdh="http://schemas.microsoft.com/office/word/2020/wordml/sdtdatahash" xmlns:w16sdtfl="http://schemas.microsoft.com/office/word/2024/wordml/sdtformatlock" xmlns:w16se="http://schemas.microsoft.com/office/word/2015/wordml/symex" xmlns:wpg="http://schemas.microsoft.com/office/word/2010/wordprocessingGroup" xmlns:wpi="http://schemas.microsoft.com/office/word/2010/wordprocessingInk" xmlns:wne="http://schemas.microsoft.com/office/word/2006/wordml" xmlns:wps="http://schemas.microsoft.com/office/word/2010/wordprocessingShape" mc:Ignorable="w14 w15 w16se w16cid w16 w16cex w16sdtdh w16sdtfl w16du wp14">
+<w:document xmlns:wpc="http://schemas.microsoft.com/office/word/2010/wordprocessingCanvas" xmlns:cx="http://schemas.microsoft.com/office/drawing/2014/chartex" xmlns:cx1="http://schemas.microsoft.com/office/drawing/2015/9/8/chartex" xmlns:cx2="http://schemas.microsoft.com/office/drawing/2015/10/21/chartex" xmlns:cx3="http://schemas.microsoft.com/office/drawing/2016/5/9/chartex" xmlns:cx4="http://schemas.microsoft.com/office/drawing/2016/5/10/chartex" xmlns:cx5="http://schemas.microsoft.com/office/drawing/2016/5/11/chartex" xmlns:cx6="http://schemas.microsoft.com/office/drawing/2016/5/12/chartex" xmlns:cx7="http://schemas.microsoft.com/office/drawing/2016/5/13/chartex" xmlns:cx8="http://schemas.microsoft.com/office/drawing/2016/5/14/chartex" xmlns:mc="http://schemas.openxmlformats.org/markup-compatibility/2006" xmlns:aink="http://schemas.microsoft.com/office/drawing/2016/ink" xmlns:am3d="http://schemas.microsoft.com/office/drawing/2017/model3d" xmlns:o="urn:schemas-microsoft-com:office:office" xmlns:oel="http://schemas.microsoft.com/office/2019/extlst" xmlns:r="http://schemas.openxmlformats.org/officeDocument/2006/relationships" xmlns:m="http://schemas.openxmlformats.org/officeDocument/2006/math" xmlns:v="urn:schemas-microsoft-com:vml" xmlns:wp14="http://schemas.microsoft.com/office/word/2010/wordprocessingDrawing" xmlns:wp="http://schemas.openxmlformats.org/drawingml/2006/wordprocessingDrawing" xmlns:w10="urn:schemas-microsoft-com:office:word" xmlns:w="http://schemas.openxmlformats.org/wordprocessingml/2006/main" xmlns:w14="http://schemas.microsoft.com/office/word/2010/wordml" xmlns:w15="http://schemas.microsoft.com/office/word/2012/wordml" xmlns:w16cex="http://schemas.microsoft.com/office/word/2018/wordml/cex" xmlns:w16cid="http://schemas.microsoft.com/office/word/2016/wordml/cid" xmlns:w16="http://schemas.microsoft.com/office/word/2018/wordml" xmlns:w16du="http://schemas.microsoft.com/office/word/2023/wordml/word16du" xmlns:w16sdtdh="http://schemas.microsoft.com/office/word/2020/wordml/sdtdatahash" xmlns:w16sdtfl="http://schemas.microsoft.com/office/word/2024/wordml/sdtformatlock" xmlns:w16se="http://schemas.microsoft.com/office/word/2015/wordml/symex" xmlns:wpg="http://schemas.microsoft.com/office/word/2010/wordprocessingGroup" xmlns:wpi="http://schemas.microsoft.com/office/word/2010/wordprocessingInk" xmlns:wne="http://schemas.microsoft.com/office/word/2006/wordml" xmlns:wps="http://schemas.microsoft.com/office/word/2010/wordprocessingShape" mc:Ignorable="w14 w15 w16se w16cid w16 w16cex w16sdtdh w16sdtfl w16du wp14">
   <w:body>
     <w:p>
       <w:pPr>
@@ -8,7 +8,7 @@
         <w:ind w:left="-360"/>
         <w:jc w:val="center"/>
         <w:rPr>
-          <w:rFonts w:ascii="Calibri" w:hAnsi="Calibri" w:cs="Calibri" w:eastAsiaTheme="minorEastAsia"/>
+          <w:rFonts w:ascii="Calibri" w:eastAsiaTheme="minorEastAsia" w:hAnsi="Calibri" w:cs="Calibri"/>
           <w:b/>
           <w:color w:val="58585A"/>
           <w:sz w:val="26"/>
@@ -19,7 +19,7 @@
       </w:pPr>
       <w:r>
         <w:rPr>
-          <w:rFonts w:ascii="Calibri" w:hAnsi="Calibri" w:cs="Calibri" w:eastAsiaTheme="minorEastAsia"/>
+          <w:rFonts w:ascii="Calibri" w:eastAsiaTheme="minorEastAsia" w:hAnsi="Calibri" w:cs="Calibri"/>
           <w:b/>
           <w:sz w:val="26"/>
           <w:szCs w:val="26"/>
@@ -30,7 +30,7 @@
       </w:r>
       <w:r>
         <w:rPr>
-          <w:rFonts w:ascii="Calibri" w:hAnsi="Calibri" w:cs="Calibri" w:eastAsiaTheme="minorEastAsia"/>
+          <w:rFonts w:ascii="Calibri" w:eastAsiaTheme="minorEastAsia" w:hAnsi="Calibri" w:cs="Calibri"/>
           <w:b/>
           <w:sz w:val="26"/>
           <w:szCs w:val="26"/>
@@ -41,7 +41,7 @@
       </w:r>
       <w:r>
         <w:rPr>
-          <w:rFonts w:ascii="Calibri" w:hAnsi="Calibri" w:cs="Calibri" w:eastAsiaTheme="minorEastAsia"/>
+          <w:rFonts w:ascii="Calibri" w:eastAsiaTheme="minorEastAsia" w:hAnsi="Calibri" w:cs="Calibri"/>
           <w:b/>
           <w:sz w:val="26"/>
           <w:szCs w:val="26"/>
@@ -52,7 +52,7 @@
       </w:r>
       <w:r>
         <w:rPr>
-          <w:rFonts w:ascii="Calibri" w:hAnsi="Calibri" w:cs="Calibri" w:eastAsiaTheme="minorEastAsia"/>
+          <w:rFonts w:ascii="Calibri" w:eastAsiaTheme="minorEastAsia" w:hAnsi="Calibri" w:cs="Calibri"/>
           <w:b/>
           <w:sz w:val="26"/>
           <w:szCs w:val="26"/>
@@ -63,7 +63,7 @@
       </w:r>
       <w:r>
         <w:rPr>
-          <w:rFonts w:ascii="Calibri" w:hAnsi="Calibri" w:cs="Calibri" w:eastAsiaTheme="minorEastAsia"/>
+          <w:rFonts w:ascii="Calibri" w:eastAsiaTheme="minorEastAsia" w:hAnsi="Calibri" w:cs="Calibri"/>
           <w:b/>
           <w:sz w:val="26"/>
           <w:szCs w:val="26"/>
@@ -74,7 +74,7 @@
       </w:r>
       <w:r>
         <w:rPr>
-          <w:rFonts w:ascii="Calibri" w:hAnsi="Calibri" w:cs="Calibri" w:eastAsiaTheme="minorEastAsia"/>
+          <w:rFonts w:ascii="Calibri" w:eastAsiaTheme="minorEastAsia" w:hAnsi="Calibri" w:cs="Calibri"/>
           <w:b/>
           <w:sz w:val="26"/>
           <w:szCs w:val="26"/>
@@ -85,7 +85,7 @@
       </w:r>
       <w:r>
         <w:rPr>
-          <w:rFonts w:ascii="Calibri" w:hAnsi="Calibri" w:cs="Calibri" w:eastAsiaTheme="minorEastAsia"/>
+          <w:rFonts w:ascii="Calibri" w:eastAsiaTheme="minorEastAsia" w:hAnsi="Calibri" w:cs="Calibri"/>
           <w:b/>
           <w:sz w:val="26"/>
           <w:szCs w:val="26"/>
@@ -100,10 +100,10 @@
         <w:tblpPr w:leftFromText="180" w:rightFromText="180" w:vertAnchor="text" w:horzAnchor="margin" w:tblpXSpec="center" w:tblpY="42"/>
         <w:tblW w:w="10339" w:type="dxa"/>
         <w:tblBorders>
-          <w:top w:val="single" w:color="5B8C9C" w:sz="12" w:space="0"/>
-          <w:left w:val="single" w:color="5B8C9C" w:sz="12" w:space="0"/>
-          <w:bottom w:val="single" w:color="5B8C9C" w:sz="12" w:space="0"/>
-          <w:right w:val="single" w:color="5B8C9C" w:sz="12" w:space="0"/>
+          <w:top w:val="single" w:sz="12" w:space="0" w:color="5B8C9C"/>
+          <w:left w:val="single" w:sz="12" w:space="0" w:color="5B8C9C"/>
+          <w:bottom w:val="single" w:sz="12" w:space="0" w:color="5B8C9C"/>
+          <w:right w:val="single" w:sz="12" w:space="0" w:color="5B8C9C"/>
         </w:tblBorders>
         <w:tblLook w:val="04A0" w:firstRow="1" w:lastRow="0" w:firstColumn="1" w:lastColumn="0" w:noHBand="0" w:noVBand="1"/>
       </w:tblPr>
@@ -121,8 +121,8 @@
           <w:tcPr>
             <w:tcW w:w="2595" w:type="dxa"/>
             <w:tcBorders>
-              <w:bottom w:val="single" w:color="5B8C9C" w:sz="8" w:space="0"/>
-              <w:right w:val="single" w:color="5B8C9C" w:sz="8" w:space="0"/>
+              <w:bottom w:val="single" w:sz="8" w:space="0" w:color="5B8C9C"/>
+              <w:right w:val="single" w:sz="8" w:space="0" w:color="5B8C9C"/>
             </w:tcBorders>
             <w:vAlign w:val="center"/>
           </w:tcPr>
@@ -152,10 +152,10 @@
           <w:tcPr>
             <w:tcW w:w="4140" w:type="dxa"/>
             <w:tcBorders>
-              <w:top w:val="single" w:color="5B8C9C" w:sz="12" w:space="0"/>
-              <w:left w:val="single" w:color="5B8C9C" w:sz="8" w:space="0"/>
-              <w:bottom w:val="single" w:color="5B8C9C" w:sz="8" w:space="0"/>
-              <w:right w:val="single" w:color="5B8C9C" w:sz="8" w:space="0"/>
+              <w:top w:val="single" w:sz="12" w:space="0" w:color="5B8C9C"/>
+              <w:left w:val="single" w:sz="8" w:space="0" w:color="5B8C9C"/>
+              <w:bottom w:val="single" w:sz="8" w:space="0" w:color="5B8C9C"/>
+              <w:right w:val="single" w:sz="8" w:space="0" w:color="5B8C9C"/>
             </w:tcBorders>
             <w:vAlign w:val="center"/>
           </w:tcPr>
@@ -193,10 +193,10 @@
           <w:tcPr>
             <w:tcW w:w="2160" w:type="dxa"/>
             <w:tcBorders>
-              <w:top w:val="single" w:color="5B8C9C" w:sz="12" w:space="0"/>
-              <w:left w:val="single" w:color="5B8C9C" w:sz="8" w:space="0"/>
-              <w:bottom w:val="single" w:color="5B8C9C" w:sz="8" w:space="0"/>
-              <w:right w:val="single" w:color="5B8C9C" w:sz="8" w:space="0"/>
+              <w:top w:val="single" w:sz="12" w:space="0" w:color="5B8C9C"/>
+              <w:left w:val="single" w:sz="8" w:space="0" w:color="5B8C9C"/>
+              <w:bottom w:val="single" w:sz="8" w:space="0" w:color="5B8C9C"/>
+              <w:right w:val="single" w:sz="8" w:space="0" w:color="5B8C9C"/>
             </w:tcBorders>
             <w:vAlign w:val="center"/>
           </w:tcPr>
@@ -224,9 +224,9 @@
           <w:tcPr>
             <w:tcW w:w="1444" w:type="dxa"/>
             <w:tcBorders>
-              <w:top w:val="single" w:color="5B8C9C" w:sz="12" w:space="0"/>
-              <w:left w:val="single" w:color="5B8C9C" w:sz="8" w:space="0"/>
-              <w:bottom w:val="single" w:color="5B8C9C" w:sz="8" w:space="0"/>
+              <w:top w:val="single" w:sz="12" w:space="0" w:color="5B8C9C"/>
+              <w:left w:val="single" w:sz="8" w:space="0" w:color="5B8C9C"/>
+              <w:bottom w:val="single" w:sz="8" w:space="0" w:color="5B8C9C"/>
             </w:tcBorders>
             <w:vAlign w:val="center"/>
           </w:tcPr>
@@ -303,9 +303,9 @@
           <w:tcPr>
             <w:tcW w:w="2595" w:type="dxa"/>
             <w:tcBorders>
-              <w:top w:val="single" w:color="5B8C9C" w:sz="8" w:space="0"/>
-              <w:bottom w:val="single" w:color="5B8C9C" w:sz="8" w:space="0"/>
-              <w:right w:val="single" w:color="5B8C9C" w:sz="8" w:space="0"/>
+              <w:top w:val="single" w:sz="8" w:space="0" w:color="5B8C9C"/>
+              <w:bottom w:val="single" w:sz="8" w:space="0" w:color="5B8C9C"/>
+              <w:right w:val="single" w:sz="8" w:space="0" w:color="5B8C9C"/>
             </w:tcBorders>
             <w:vAlign w:val="center"/>
           </w:tcPr>
@@ -334,9 +334,9 @@
             <w:tcW w:w="7744" w:type="dxa"/>
             <w:gridSpan w:val="3"/>
             <w:tcBorders>
-              <w:top w:val="single" w:color="5B8C9C" w:sz="8" w:space="0"/>
-              <w:left w:val="single" w:color="5B8C9C" w:sz="8" w:space="0"/>
-              <w:bottom w:val="single" w:color="5B8C9C" w:sz="8" w:space="0"/>
+              <w:top w:val="single" w:sz="8" w:space="0" w:color="5B8C9C"/>
+              <w:left w:val="single" w:sz="8" w:space="0" w:color="5B8C9C"/>
+              <w:bottom w:val="single" w:sz="8" w:space="0" w:color="5B8C9C"/>
             </w:tcBorders>
             <w:vAlign w:val="center"/>
           </w:tcPr>
@@ -394,9 +394,9 @@
           <w:tcPr>
             <w:tcW w:w="2595" w:type="dxa"/>
             <w:tcBorders>
-              <w:top w:val="single" w:color="5B8C9C" w:sz="8" w:space="0"/>
-              <w:bottom w:val="single" w:color="5B8C9C" w:sz="8" w:space="0"/>
-              <w:right w:val="single" w:color="5B8C9C" w:sz="8" w:space="0"/>
+              <w:top w:val="single" w:sz="8" w:space="0" w:color="5B8C9C"/>
+              <w:bottom w:val="single" w:sz="8" w:space="0" w:color="5B8C9C"/>
+              <w:right w:val="single" w:sz="8" w:space="0" w:color="5B8C9C"/>
             </w:tcBorders>
             <w:vAlign w:val="center"/>
           </w:tcPr>
@@ -425,9 +425,9 @@
             <w:tcW w:w="7744" w:type="dxa"/>
             <w:gridSpan w:val="3"/>
             <w:tcBorders>
-              <w:top w:val="single" w:color="5B8C9C" w:sz="8" w:space="0"/>
-              <w:left w:val="single" w:color="5B8C9C" w:sz="8" w:space="0"/>
-              <w:bottom w:val="single" w:color="5B8C9C" w:sz="8" w:space="0"/>
+              <w:top w:val="single" w:sz="8" w:space="0" w:color="5B8C9C"/>
+              <w:left w:val="single" w:sz="8" w:space="0" w:color="5B8C9C"/>
+              <w:bottom w:val="single" w:sz="8" w:space="0" w:color="5B8C9C"/>
             </w:tcBorders>
             <w:vAlign w:val="center"/>
           </w:tcPr>
@@ -478,9 +478,9 @@
           <w:tcPr>
             <w:tcW w:w="2595" w:type="dxa"/>
             <w:tcBorders>
-              <w:top w:val="single" w:color="5B8C9C" w:sz="8" w:space="0"/>
-              <w:bottom w:val="single" w:color="5B8C9C" w:sz="8" w:space="0"/>
-              <w:right w:val="single" w:color="5B8C9C" w:sz="8" w:space="0"/>
+              <w:top w:val="single" w:sz="8" w:space="0" w:color="5B8C9C"/>
+              <w:bottom w:val="single" w:sz="8" w:space="0" w:color="5B8C9C"/>
+              <w:right w:val="single" w:sz="8" w:space="0" w:color="5B8C9C"/>
             </w:tcBorders>
             <w:vAlign w:val="center"/>
           </w:tcPr>
@@ -508,10 +508,10 @@
           <w:tcPr>
             <w:tcW w:w="4140" w:type="dxa"/>
             <w:tcBorders>
-              <w:top w:val="single" w:color="5B8C9C" w:sz="8" w:space="0"/>
-              <w:left w:val="single" w:color="5B8C9C" w:sz="8" w:space="0"/>
-              <w:bottom w:val="single" w:color="5B8C9C" w:sz="8" w:space="0"/>
-              <w:right w:val="single" w:color="5B8C9C" w:sz="8" w:space="0"/>
+              <w:top w:val="single" w:sz="8" w:space="0" w:color="5B8C9C"/>
+              <w:left w:val="single" w:sz="8" w:space="0" w:color="5B8C9C"/>
+              <w:bottom w:val="single" w:sz="8" w:space="0" w:color="5B8C9C"/>
+              <w:right w:val="single" w:sz="8" w:space="0" w:color="5B8C9C"/>
             </w:tcBorders>
             <w:vAlign w:val="center"/>
           </w:tcPr>
@@ -551,10 +551,10 @@
           <w:tcPr>
             <w:tcW w:w="2160" w:type="dxa"/>
             <w:tcBorders>
-              <w:top w:val="single" w:color="5B8C9C" w:sz="8" w:space="0"/>
-              <w:left w:val="single" w:color="5B8C9C" w:sz="8" w:space="0"/>
-              <w:bottom w:val="single" w:color="5B8C9C" w:sz="8" w:space="0"/>
-              <w:right w:val="single" w:color="5B8C9C" w:sz="8" w:space="0"/>
+              <w:top w:val="single" w:sz="8" w:space="0" w:color="5B8C9C"/>
+              <w:left w:val="single" w:sz="8" w:space="0" w:color="5B8C9C"/>
+              <w:bottom w:val="single" w:sz="8" w:space="0" w:color="5B8C9C"/>
+              <w:right w:val="single" w:sz="8" w:space="0" w:color="5B8C9C"/>
             </w:tcBorders>
             <w:vAlign w:val="center"/>
           </w:tcPr>
@@ -600,9 +600,9 @@
           <w:tcPr>
             <w:tcW w:w="1444" w:type="dxa"/>
             <w:tcBorders>
-              <w:top w:val="single" w:color="5B8C9C" w:sz="8" w:space="0"/>
-              <w:left w:val="single" w:color="5B8C9C" w:sz="8" w:space="0"/>
-              <w:bottom w:val="single" w:color="5B8C9C" w:sz="8" w:space="0"/>
+              <w:top w:val="single" w:sz="8" w:space="0" w:color="5B8C9C"/>
+              <w:left w:val="single" w:sz="8" w:space="0" w:color="5B8C9C"/>
+              <w:bottom w:val="single" w:sz="8" w:space="0" w:color="5B8C9C"/>
             </w:tcBorders>
             <w:vAlign w:val="center"/>
           </w:tcPr>
@@ -653,9 +653,9 @@
           <w:tcPr>
             <w:tcW w:w="2595" w:type="dxa"/>
             <w:tcBorders>
-              <w:top w:val="single" w:color="5B8C9C" w:sz="8" w:space="0"/>
-              <w:bottom w:val="single" w:color="5B8C9C" w:sz="8" w:space="0"/>
-              <w:right w:val="single" w:color="5B8C9C" w:sz="8" w:space="0"/>
+              <w:top w:val="single" w:sz="8" w:space="0" w:color="5B8C9C"/>
+              <w:bottom w:val="single" w:sz="8" w:space="0" w:color="5B8C9C"/>
+              <w:right w:val="single" w:sz="8" w:space="0" w:color="5B8C9C"/>
             </w:tcBorders>
             <w:vAlign w:val="center"/>
           </w:tcPr>
@@ -683,10 +683,10 @@
           <w:tcPr>
             <w:tcW w:w="4140" w:type="dxa"/>
             <w:tcBorders>
-              <w:top w:val="single" w:color="5B8C9C" w:sz="8" w:space="0"/>
-              <w:left w:val="single" w:color="5B8C9C" w:sz="8" w:space="0"/>
-              <w:bottom w:val="single" w:color="5B8C9C" w:sz="8" w:space="0"/>
-              <w:right w:val="single" w:color="5B8C9C" w:sz="8" w:space="0"/>
+              <w:top w:val="single" w:sz="8" w:space="0" w:color="5B8C9C"/>
+              <w:left w:val="single" w:sz="8" w:space="0" w:color="5B8C9C"/>
+              <w:bottom w:val="single" w:sz="8" w:space="0" w:color="5B8C9C"/>
+              <w:right w:val="single" w:sz="8" w:space="0" w:color="5B8C9C"/>
             </w:tcBorders>
             <w:vAlign w:val="center"/>
           </w:tcPr>
@@ -726,10 +726,10 @@
           <w:tcPr>
             <w:tcW w:w="2160" w:type="dxa"/>
             <w:tcBorders>
-              <w:top w:val="single" w:color="5B8C9C" w:sz="8" w:space="0"/>
-              <w:left w:val="single" w:color="5B8C9C" w:sz="8" w:space="0"/>
-              <w:bottom w:val="single" w:color="5B8C9C" w:sz="8" w:space="0"/>
-              <w:right w:val="single" w:color="5B8C9C" w:sz="8" w:space="0"/>
+              <w:top w:val="single" w:sz="8" w:space="0" w:color="5B8C9C"/>
+              <w:left w:val="single" w:sz="8" w:space="0" w:color="5B8C9C"/>
+              <w:bottom w:val="single" w:sz="8" w:space="0" w:color="5B8C9C"/>
+              <w:right w:val="single" w:sz="8" w:space="0" w:color="5B8C9C"/>
             </w:tcBorders>
             <w:vAlign w:val="center"/>
           </w:tcPr>
@@ -757,9 +757,9 @@
           <w:tcPr>
             <w:tcW w:w="1444" w:type="dxa"/>
             <w:tcBorders>
-              <w:top w:val="single" w:color="5B8C9C" w:sz="8" w:space="0"/>
-              <w:left w:val="single" w:color="5B8C9C" w:sz="8" w:space="0"/>
-              <w:bottom w:val="single" w:color="5B8C9C" w:sz="8" w:space="0"/>
+              <w:top w:val="single" w:sz="8" w:space="0" w:color="5B8C9C"/>
+              <w:left w:val="single" w:sz="8" w:space="0" w:color="5B8C9C"/>
+              <w:bottom w:val="single" w:sz="8" w:space="0" w:color="5B8C9C"/>
             </w:tcBorders>
             <w:vAlign w:val="center"/>
           </w:tcPr>
@@ -804,9 +804,9 @@
           <w:tcPr>
             <w:tcW w:w="2595" w:type="dxa"/>
             <w:tcBorders>
-              <w:top w:val="single" w:color="5B8C9C" w:sz="8" w:space="0"/>
-              <w:bottom w:val="single" w:color="5B8C9C" w:sz="8" w:space="0"/>
-              <w:right w:val="single" w:color="5B8C9C" w:sz="8" w:space="0"/>
+              <w:top w:val="single" w:sz="8" w:space="0" w:color="5B8C9C"/>
+              <w:bottom w:val="single" w:sz="8" w:space="0" w:color="5B8C9C"/>
+              <w:right w:val="single" w:sz="8" w:space="0" w:color="5B8C9C"/>
             </w:tcBorders>
             <w:vAlign w:val="center"/>
           </w:tcPr>
@@ -835,9 +835,9 @@
             <w:tcW w:w="7744" w:type="dxa"/>
             <w:gridSpan w:val="3"/>
             <w:tcBorders>
-              <w:top w:val="single" w:color="5B8C9C" w:sz="8" w:space="0"/>
-              <w:left w:val="single" w:color="5B8C9C" w:sz="8" w:space="0"/>
-              <w:bottom w:val="single" w:color="5B8C9C" w:sz="8" w:space="0"/>
+              <w:top w:val="single" w:sz="8" w:space="0" w:color="5B8C9C"/>
+              <w:left w:val="single" w:sz="8" w:space="0" w:color="5B8C9C"/>
+              <w:bottom w:val="single" w:sz="8" w:space="0" w:color="5B8C9C"/>
             </w:tcBorders>
             <w:vAlign w:val="center"/>
           </w:tcPr>
@@ -882,9 +882,9 @@
           <w:tcPr>
             <w:tcW w:w="2595" w:type="dxa"/>
             <w:tcBorders>
-              <w:top w:val="single" w:color="5B8C9C" w:sz="8" w:space="0"/>
-              <w:bottom w:val="single" w:color="5B8C9C" w:sz="8" w:space="0"/>
-              <w:right w:val="single" w:color="5B8C9C" w:sz="8" w:space="0"/>
+              <w:top w:val="single" w:sz="8" w:space="0" w:color="5B8C9C"/>
+              <w:bottom w:val="single" w:sz="8" w:space="0" w:color="5B8C9C"/>
+              <w:right w:val="single" w:sz="8" w:space="0" w:color="5B8C9C"/>
             </w:tcBorders>
             <w:vAlign w:val="center"/>
           </w:tcPr>
@@ -931,9 +931,9 @@
             <w:tcW w:w="7744" w:type="dxa"/>
             <w:gridSpan w:val="3"/>
             <w:tcBorders>
-              <w:top w:val="single" w:color="5B8C9C" w:sz="8" w:space="0"/>
-              <w:left w:val="single" w:color="5B8C9C" w:sz="8" w:space="0"/>
-              <w:bottom w:val="single" w:color="5B8C9C" w:sz="8" w:space="0"/>
+              <w:top w:val="single" w:sz="8" w:space="0" w:color="5B8C9C"/>
+              <w:left w:val="single" w:sz="8" w:space="0" w:color="5B8C9C"/>
+              <w:bottom w:val="single" w:sz="8" w:space="0" w:color="5B8C9C"/>
             </w:tcBorders>
             <w:vAlign w:val="center"/>
           </w:tcPr>
@@ -978,8 +978,8 @@
           <w:tcPr>
             <w:tcW w:w="2595" w:type="dxa"/>
             <w:tcBorders>
-              <w:top w:val="single" w:color="5B8C9C" w:sz="8" w:space="0"/>
-              <w:right w:val="single" w:color="5B8C9C" w:sz="8" w:space="0"/>
+              <w:top w:val="single" w:sz="8" w:space="0" w:color="5B8C9C"/>
+              <w:right w:val="single" w:sz="8" w:space="0" w:color="5B8C9C"/>
             </w:tcBorders>
             <w:vAlign w:val="center"/>
           </w:tcPr>
@@ -1026,9 +1026,9 @@
             <w:tcW w:w="7744" w:type="dxa"/>
             <w:gridSpan w:val="3"/>
             <w:tcBorders>
-              <w:top w:val="single" w:color="5B8C9C" w:sz="8" w:space="0"/>
-              <w:left w:val="single" w:color="5B8C9C" w:sz="8" w:space="0"/>
-              <w:bottom w:val="single" w:color="5B8C9C" w:sz="12" w:space="0"/>
+              <w:top w:val="single" w:sz="8" w:space="0" w:color="5B8C9C"/>
+              <w:left w:val="single" w:sz="8" w:space="0" w:color="5B8C9C"/>
+              <w:bottom w:val="single" w:sz="12" w:space="0" w:color="5B8C9C"/>
             </w:tcBorders>
             <w:vAlign w:val="center"/>
           </w:tcPr>
@@ -1078,7 +1078,7 @@
         <w:ind w:left="-360"/>
         <w:jc w:val="both"/>
         <w:rPr>
-          <w:rFonts w:ascii="Calibri" w:hAnsi="Calibri" w:cs="Calibri" w:eastAsiaTheme="minorEastAsia"/>
+          <w:rFonts w:ascii="Calibri" w:eastAsiaTheme="minorEastAsia" w:hAnsi="Calibri" w:cs="Calibri"/>
           <w:b/>
           <w:sz w:val="25"/>
           <w:szCs w:val="25"/>
@@ -1087,7 +1087,7 @@
       </w:pPr>
       <w:r>
         <w:rPr>
-          <w:rFonts w:ascii="Calibri" w:hAnsi="Calibri" w:cs="Calibri" w:eastAsiaTheme="minorEastAsia"/>
+          <w:rFonts w:ascii="Calibri" w:eastAsiaTheme="minorEastAsia" w:hAnsi="Calibri" w:cs="Calibri"/>
           <w:b/>
           <w:sz w:val="25"/>
           <w:szCs w:val="25"/>
@@ -1097,7 +1097,7 @@
       </w:r>
       <w:r>
         <w:rPr>
-          <w:rFonts w:ascii="Calibri" w:hAnsi="Calibri" w:cs="Calibri" w:eastAsiaTheme="minorEastAsia"/>
+          <w:rFonts w:ascii="Calibri" w:eastAsiaTheme="minorEastAsia" w:hAnsi="Calibri" w:cs="Calibri"/>
           <w:b/>
           <w:sz w:val="25"/>
           <w:szCs w:val="25"/>
@@ -1107,7 +1107,7 @@
       </w:r>
       <w:r>
         <w:rPr>
-          <w:rFonts w:ascii="Calibri" w:hAnsi="Calibri" w:cs="Calibri" w:eastAsiaTheme="minorEastAsia"/>
+          <w:rFonts w:ascii="Calibri" w:eastAsiaTheme="minorEastAsia" w:hAnsi="Calibri" w:cs="Calibri"/>
           <w:b/>
           <w:sz w:val="25"/>
           <w:szCs w:val="25"/>
@@ -1117,7 +1117,7 @@
       </w:r>
       <w:r>
         <w:rPr>
-          <w:rFonts w:ascii="Calibri" w:hAnsi="Calibri" w:cs="Calibri" w:eastAsiaTheme="minorEastAsia"/>
+          <w:rFonts w:ascii="Calibri" w:eastAsiaTheme="minorEastAsia" w:hAnsi="Calibri" w:cs="Calibri"/>
           <w:b/>
           <w:sz w:val="25"/>
           <w:szCs w:val="25"/>
@@ -1127,7 +1127,7 @@
       </w:r>
       <w:r>
         <w:rPr>
-          <w:rFonts w:ascii="Calibri" w:hAnsi="Calibri" w:cs="Calibri" w:eastAsiaTheme="minorEastAsia"/>
+          <w:rFonts w:ascii="Calibri" w:eastAsiaTheme="minorEastAsia" w:hAnsi="Calibri" w:cs="Calibri"/>
           <w:b/>
           <w:sz w:val="25"/>
           <w:szCs w:val="25"/>
@@ -1137,7 +1137,7 @@
       </w:r>
       <w:r>
         <w:rPr>
-          <w:rFonts w:ascii="Calibri" w:hAnsi="Calibri" w:cs="Calibri" w:eastAsiaTheme="minorEastAsia"/>
+          <w:rFonts w:ascii="Calibri" w:eastAsiaTheme="minorEastAsia" w:hAnsi="Calibri" w:cs="Calibri"/>
           <w:b/>
           <w:sz w:val="25"/>
           <w:szCs w:val="25"/>
@@ -1147,7 +1147,7 @@
       </w:r>
       <w:r>
         <w:rPr>
-          <w:rFonts w:ascii="Calibri" w:hAnsi="Calibri" w:cs="Calibri" w:eastAsiaTheme="minorEastAsia"/>
+          <w:rFonts w:ascii="Calibri" w:eastAsiaTheme="minorEastAsia" w:hAnsi="Calibri" w:cs="Calibri"/>
           <w:b/>
           <w:sz w:val="25"/>
           <w:szCs w:val="25"/>
@@ -1198,7 +1198,7 @@
         <w:ind w:left="-360"/>
         <w:jc w:val="both"/>
         <w:rPr>
-          <w:rFonts w:ascii="Calibri" w:hAnsi="Calibri" w:cs="Calibri" w:eastAsiaTheme="minorEastAsia"/>
+          <w:rFonts w:ascii="Calibri" w:eastAsiaTheme="minorEastAsia" w:hAnsi="Calibri" w:cs="Calibri"/>
           <w:b/>
           <w:sz w:val="25"/>
           <w:szCs w:val="25"/>
@@ -1207,7 +1207,7 @@
       </w:pPr>
       <w:r>
         <w:rPr>
-          <w:rFonts w:ascii="Calibri" w:hAnsi="Calibri" w:cs="Calibri" w:eastAsiaTheme="minorEastAsia"/>
+          <w:rFonts w:ascii="Calibri" w:eastAsiaTheme="minorEastAsia" w:hAnsi="Calibri" w:cs="Calibri"/>
           <w:b/>
           <w:sz w:val="25"/>
           <w:szCs w:val="25"/>
@@ -1251,7 +1251,7 @@
         <w:ind w:left="-360"/>
         <w:jc w:val="both"/>
         <w:rPr>
-          <w:rFonts w:ascii="Calibri" w:hAnsi="Calibri" w:cs="Calibri" w:eastAsiaTheme="minorEastAsia"/>
+          <w:rFonts w:ascii="Calibri" w:eastAsiaTheme="minorEastAsia" w:hAnsi="Calibri" w:cs="Calibri"/>
           <w:b/>
           <w:sz w:val="25"/>
           <w:szCs w:val="25"/>
@@ -1260,7 +1260,7 @@
       </w:pPr>
       <w:r>
         <w:rPr>
-          <w:rFonts w:ascii="Calibri" w:hAnsi="Calibri" w:cs="Calibri" w:eastAsiaTheme="minorEastAsia"/>
+          <w:rFonts w:ascii="Calibri" w:eastAsiaTheme="minorEastAsia" w:hAnsi="Calibri" w:cs="Calibri"/>
           <w:b/>
           <w:sz w:val="25"/>
           <w:szCs w:val="25"/>
@@ -1270,7 +1270,7 @@
       </w:r>
       <w:r>
         <w:rPr>
-          <w:rFonts w:ascii="Calibri" w:hAnsi="Calibri" w:cs="Calibri" w:eastAsiaTheme="minorEastAsia"/>
+          <w:rFonts w:ascii="Calibri" w:eastAsiaTheme="minorEastAsia" w:hAnsi="Calibri" w:cs="Calibri"/>
           <w:b/>
           <w:sz w:val="25"/>
           <w:szCs w:val="25"/>
@@ -1280,7 +1280,7 @@
       </w:r>
       <w:r>
         <w:rPr>
-          <w:rFonts w:ascii="Calibri" w:hAnsi="Calibri" w:cs="Calibri" w:eastAsiaTheme="minorEastAsia"/>
+          <w:rFonts w:ascii="Calibri" w:eastAsiaTheme="minorEastAsia" w:hAnsi="Calibri" w:cs="Calibri"/>
           <w:b/>
           <w:sz w:val="25"/>
           <w:szCs w:val="25"/>
@@ -1290,7 +1290,7 @@
       </w:r>
       <w:r>
         <w:rPr>
-          <w:rFonts w:ascii="Calibri" w:hAnsi="Calibri" w:cs="Calibri" w:eastAsiaTheme="minorEastAsia"/>
+          <w:rFonts w:ascii="Calibri" w:eastAsiaTheme="minorEastAsia" w:hAnsi="Calibri" w:cs="Calibri"/>
           <w:b/>
           <w:sz w:val="25"/>
           <w:szCs w:val="25"/>
@@ -1300,7 +1300,7 @@
       </w:r>
       <w:r>
         <w:rPr>
-          <w:rFonts w:ascii="Calibri" w:hAnsi="Calibri" w:cs="Calibri" w:eastAsiaTheme="minorEastAsia"/>
+          <w:rFonts w:ascii="Calibri" w:eastAsiaTheme="minorEastAsia" w:hAnsi="Calibri" w:cs="Calibri"/>
           <w:b/>
           <w:sz w:val="25"/>
           <w:szCs w:val="25"/>
@@ -1344,7 +1344,7 @@
         <w:ind w:left="-360"/>
         <w:jc w:val="both"/>
         <w:rPr>
-          <w:rFonts w:ascii="Calibri" w:hAnsi="Calibri" w:cs="Calibri" w:eastAsiaTheme="minorEastAsia"/>
+          <w:rFonts w:ascii="Calibri" w:eastAsiaTheme="minorEastAsia" w:hAnsi="Calibri" w:cs="Calibri"/>
           <w:b/>
           <w:sz w:val="25"/>
           <w:szCs w:val="25"/>
@@ -1353,7 +1353,7 @@
       </w:pPr>
       <w:r>
         <w:rPr>
-          <w:rFonts w:ascii="Calibri" w:hAnsi="Calibri" w:cs="Calibri" w:eastAsiaTheme="minorEastAsia"/>
+          <w:rFonts w:ascii="Calibri" w:eastAsiaTheme="minorEastAsia" w:hAnsi="Calibri" w:cs="Calibri"/>
           <w:b/>
           <w:sz w:val="25"/>
           <w:szCs w:val="25"/>
@@ -1363,7 +1363,7 @@
       </w:r>
       <w:r>
         <w:rPr>
-          <w:rFonts w:ascii="Calibri" w:hAnsi="Calibri" w:cs="Calibri" w:eastAsiaTheme="minorEastAsia"/>
+          <w:rFonts w:ascii="Calibri" w:eastAsiaTheme="minorEastAsia" w:hAnsi="Calibri" w:cs="Calibri"/>
           <w:b/>
           <w:sz w:val="25"/>
           <w:szCs w:val="25"/>
@@ -1373,7 +1373,7 @@
       </w:r>
       <w:r>
         <w:rPr>
-          <w:rFonts w:ascii="Calibri" w:hAnsi="Calibri" w:cs="Calibri" w:eastAsiaTheme="minorEastAsia"/>
+          <w:rFonts w:ascii="Calibri" w:eastAsiaTheme="minorEastAsia" w:hAnsi="Calibri" w:cs="Calibri"/>
           <w:b/>
           <w:sz w:val="25"/>
           <w:szCs w:val="25"/>
@@ -1418,7 +1418,7 @@
         <w:ind w:left="-360"/>
         <w:jc w:val="both"/>
         <w:rPr>
-          <w:rFonts w:ascii="Calibri" w:hAnsi="Calibri" w:cs="Calibri" w:eastAsiaTheme="minorEastAsia"/>
+          <w:rFonts w:ascii="Calibri" w:eastAsiaTheme="minorEastAsia" w:hAnsi="Calibri" w:cs="Calibri"/>
           <w:b/>
           <w:sz w:val="25"/>
           <w:szCs w:val="25"/>
@@ -1427,7 +1427,7 @@
       </w:pPr>
       <w:r>
         <w:rPr>
-          <w:rFonts w:ascii="Calibri" w:hAnsi="Calibri" w:cs="Calibri" w:eastAsiaTheme="minorEastAsia"/>
+          <w:rFonts w:ascii="Calibri" w:eastAsiaTheme="minorEastAsia" w:hAnsi="Calibri" w:cs="Calibri"/>
           <w:b/>
           <w:sz w:val="25"/>
           <w:szCs w:val="25"/>
@@ -1593,25 +1593,25 @@
         <w:t>Reviewed By:</w:t>
       </w:r>
     </w:p>
-    <w:sdt>
-      <w:sdtPr>
-        <w:alias w:val="inspection.signature.inspector"/>
-        <w:tag w:val="inspection.signature.inspector"/>
-        <w:id w:val="-1481758205"/>
-      </w:sdtPr>
-      <w:sdtContent>
-        <w:p>
-          <w:pPr>
-            <w:tabs>
-              <w:tab w:val="left" w:pos="5760"/>
-            </w:tabs>
-            <w:spacing w:after="0" w:line="240" w:lineRule="auto"/>
-            <w:ind w:left="-360"/>
-            <w:jc w:val="both"/>
-            <w:rPr>
-              <w:rFonts w:ascii="Calibri" w:hAnsi="Calibri" w:cs="Calibri"/>
-            </w:rPr>
-          </w:pPr>
+    <w:p>
+      <w:pPr>
+        <w:tabs>
+          <w:tab w:val="left" w:pos="5760"/>
+        </w:tabs>
+        <w:spacing w:after="0" w:line="240" w:lineRule="auto"/>
+        <w:ind w:left="-360"/>
+        <w:jc w:val="both"/>
+        <w:rPr>
+          <w:rFonts w:ascii="Calibri" w:hAnsi="Calibri" w:cs="Calibri"/>
+        </w:rPr>
+      </w:pPr>
+      <w:sdt>
+        <w:sdtPr>
+          <w:alias w:val="inspection.signature.inspector"/>
+          <w:tag w:val="inspection.signature.inspector"/>
+          <w:id w:val="-1481758205"/>
+        </w:sdtPr>
+        <w:sdtContent>
           <w:r>
             <w:rPr>
               <w:rFonts w:eastAsia="Calibri" w:cstheme="minorHAnsi"/>
@@ -1676,14 +1676,14 @@
                   </wp:inline>
                 </w:drawing>
               </mc:Choice>
-              <mc:Fallback xmlns:a="http://schemas.openxmlformats.org/drawingml/2006/main">
+              <mc:Fallback>
                 <w:pict>
-                  <v:shapetype id="_x0000_t202" coordsize="21600,21600" o:spt="202" path="m,l,21600r21600,l21600,xe" w14:anchorId="6F8FE4C5">
+                  <v:shapetype w14:anchorId="6F8FE4C5" id="_x0000_t202" coordsize="21600,21600" o:spt="202" path="m,l,21600r21600,l21600,xe">
                     <v:stroke joinstyle="miter"/>
                     <v:path gradientshapeok="t" o:connecttype="rect"/>
                   </v:shapetype>
-                  <v:shape id="Text Box 1825677346" style="width:2in;height:36pt;visibility:visible;mso-wrap-style:square;mso-left-percent:-10001;mso-top-percent:-10001;mso-position-horizontal:absolute;mso-position-horizontal-relative:char;mso-position-vertical:absolute;mso-position-vertical-relative:line;mso-left-percent:-10001;mso-top-percent:-10001;v-text-anchor:top" o:spid="_x0000_s1026" stroked="f" type="#_x0000_t202" o:gfxdata="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">
-                    <v:fill type="frame" o:title="" recolor="t" rotate="t" r:id="rId12"/>
+                  <v:shape id="Text Box 1825677346" o:spid="_x0000_s1026" type="#_x0000_t202" style="width:2in;height:36pt;visibility:visible;mso-wrap-style:square;mso-left-percent:-10001;mso-top-percent:-10001;mso-position-horizontal:absolute;mso-position-horizontal-relative:char;mso-position-vertical:absolute;mso-position-vertical-relative:line;mso-left-percent:-10001;mso-top-percent:-10001;v-text-anchor:top" o:gfxdata="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" stroked="f">
+                    <v:fill r:id="rId12" o:title="" recolor="t" rotate="t" type="frame"/>
                     <v:textbox>
                       <w:txbxContent>
                         <w:p>
@@ -1703,41 +1703,19 @@
               </mc:Fallback>
             </mc:AlternateContent>
           </w:r>
-          <w:r>
-            <w:rPr>
-              <w:rFonts w:ascii="Calibri" w:hAnsi="Calibri" w:cs="Calibri"/>
-            </w:rPr>
-            <w:tab/>
-          </w:r>
-        </w:p>
-      </w:sdtContent>
-    </w:sdt>
-    <w:sdt>
-      <w:sdtPr>
-        <w:alias w:val="inspection.signature.projectManager"/>
-        <w:tag w:val="inspection.signature.projectManager"/>
-        <w:id w:val="162596117"/>
-        <w:showingPlcHdr/>
-      </w:sdtPr>
-      <w:sdtContent>
-        <w:p>
-          <w:pPr>
-            <w:tabs>
-              <w:tab w:val="left" w:pos="5760"/>
-            </w:tabs>
-            <w:spacing w:after="0" w:line="240" w:lineRule="auto"/>
-            <w:ind w:left="-360"/>
-            <w:jc w:val="both"/>
-            <w:rPr>
-              <w:rFonts w:ascii="Calibri" w:hAnsi="Calibri" w:cs="Calibri"/>
-            </w:rPr>
-          </w:pPr>
-          <w:r>
-            <w:rPr>
-              <w:rFonts w:ascii="Calibri" w:hAnsi="Calibri" w:cs="Calibri"/>
-            </w:rPr>
-            <w:tab/>
-          </w:r>
+        </w:sdtContent>
+      </w:sdt>
+      <w:r>
+        <w:tab/>
+      </w:r>
+      <w:sdt>
+        <w:sdtPr>
+          <w:alias w:val="inspection.signature.projectManager"/>
+          <w:tag w:val="inspection.signature.projectManager"/>
+          <w:id w:val="162596117"/>
+          <w:showingPlcHdr/>
+        </w:sdtPr>
+        <w:sdtContent>
           <w:r>
             <w:rPr>
               <w:rFonts w:eastAsia="Calibri" w:cstheme="minorHAnsi"/>
@@ -1770,7 +1748,7 @@
                               <a:avLst/>
                             </a:prstGeom>
                             <a:blipFill>
-                              <a:blip r:embed="Rbfbe2846fbea437c"/>
+                              <a:blip r:embed="rId13"/>
                               <a:stretch>
                                 <a:fillRect/>
                               </a:stretch>
@@ -1804,12 +1782,8 @@
               </mc:Choice>
               <mc:Fallback>
                 <w:pict>
-                  <v:shapetype id="_x0000_t202" coordsize="21600,21600" o:spt="202" path="m,l,21600r21600,l21600,xe" w14:anchorId="3F141AB9">
-                    <v:stroke joinstyle="miter"/>
-                    <v:path gradientshapeok="t" o:connecttype="rect"/>
-                  </v:shapetype>
-                  <v:shape id="Text Box 1869884412" style="width:2in;height:36pt;visibility:visible;mso-wrap-style:square;mso-left-percent:-10001;mso-top-percent:-10001;mso-position-horizontal:absolute;mso-position-horizontal-relative:char;mso-position-vertical:absolute;mso-position-vertical-relative:line;mso-left-percent:-10001;mso-top-percent:-10001;v-text-anchor:top" o:spid="_x0000_s1027" stroked="f" type="#_x0000_t202" o:gfxdata="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">
-                    <v:fill type="frame" o:title="" recolor="t" rotate="t" r:id="rId14"/>
+                  <v:shape w14:anchorId="3F141AB9" id="Text Box 1869884412" o:spid="_x0000_s1027" type="#_x0000_t202" style="width:2in;height:36pt;visibility:visible;mso-wrap-style:square;mso-left-percent:-10001;mso-top-percent:-10001;mso-position-horizontal:absolute;mso-position-horizontal-relative:char;mso-position-vertical:absolute;mso-position-vertical-relative:line;mso-left-percent:-10001;mso-top-percent:-10001;v-text-anchor:top" o:gfxdata="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" stroked="f">
+                    <v:fill r:id="rId14" o:title="" recolor="t" rotate="t" type="frame"/>
                     <v:textbox>
                       <w:txbxContent>
                         <w:p>
@@ -1829,39 +1803,8 @@
               </mc:Fallback>
             </mc:AlternateContent>
           </w:r>
-        </w:p>
-      </w:sdtContent>
-    </w:sdt>
-    <w:p>
-      <w:pPr>
-        <w:tabs>
-          <w:tab w:val="left" w:pos="5760"/>
-        </w:tabs>
-        <w:spacing w:after="0" w:line="240" w:lineRule="auto"/>
-        <w:ind w:left="-360"/>
-        <w:jc w:val="both"/>
-        <w:rPr>
-          <w:rFonts w:ascii="Calibri" w:hAnsi="Calibri" w:cs="Calibri"/>
-        </w:rPr>
-      </w:pPr>
-      <w:r>
-        <w:rPr>
-          <w:rFonts w:ascii="Calibri" w:hAnsi="Calibri" w:cs="Calibri"/>
-        </w:rPr>
-        <w:t>Anthony Wintergerst</w:t>
-      </w:r>
-      <w:r>
-        <w:rPr>
-          <w:rFonts w:ascii="Calibri" w:hAnsi="Calibri" w:cs="Calibri"/>
-        </w:rPr>
-        <w:tab/>
-      </w:r>
-      <w:r>
-        <w:rPr>
-          <w:rFonts w:ascii="Calibri" w:hAnsi="Calibri" w:cs="Calibri"/>
-        </w:rPr>
-        <w:t>Ben Zinninger, P.E.</w:t>
-      </w:r>
+        </w:sdtContent>
+      </w:sdt>
     </w:p>
     <w:p>
       <w:pPr>
@@ -1879,6 +1822,37 @@
         <w:rPr>
           <w:rFonts w:ascii="Calibri" w:hAnsi="Calibri" w:cs="Calibri"/>
         </w:rPr>
+        <w:t>Anthony Wintergerst</w:t>
+      </w:r>
+      <w:r>
+        <w:rPr>
+          <w:rFonts w:ascii="Calibri" w:hAnsi="Calibri" w:cs="Calibri"/>
+        </w:rPr>
+        <w:tab/>
+      </w:r>
+      <w:r>
+        <w:rPr>
+          <w:rFonts w:ascii="Calibri" w:hAnsi="Calibri" w:cs="Calibri"/>
+        </w:rPr>
+        <w:t>Ben Zinninger, P.E.</w:t>
+      </w:r>
+    </w:p>
+    <w:p>
+      <w:pPr>
+        <w:tabs>
+          <w:tab w:val="left" w:pos="5760"/>
+        </w:tabs>
+        <w:spacing w:after="0" w:line="240" w:lineRule="auto"/>
+        <w:ind w:left="-360"/>
+        <w:jc w:val="both"/>
+        <w:rPr>
+          <w:rFonts w:ascii="Calibri" w:hAnsi="Calibri" w:cs="Calibri"/>
+        </w:rPr>
+      </w:pPr>
+      <w:r>
+        <w:rPr>
+          <w:rFonts w:ascii="Calibri" w:hAnsi="Calibri" w:cs="Calibri"/>
+        </w:rPr>
         <w:t>Special Inspector</w:t>
       </w:r>
       <w:r>
@@ -1920,43 +1894,28 @@
         <w:br w:type="page"/>
       </w:r>
     </w:p>
-    <w:p>
-      <w:pPr>
-        <w:spacing w:after="120"/>
-        <w:jc w:val="center"/>
-      </w:pPr>
-      <w:r>
-        <w:rPr>
-          <w:b/>
-          <w:sz w:val="24"/>
-        </w:rPr>
-        <w:lastRenderedPageBreak/>
-        <w:t>PHOTO DOCUMENTATION</w:t>
-      </w:r>
-    </w:p>
     <w:tbl>
       <w:tblPr>
-        <w:tblW w:w="0" w:type="auto"/>
-        <w:jc w:val="center"/>
+        <w:tblpPr w:leftFromText="180" w:rightFromText="180" w:vertAnchor="page" w:horzAnchor="margin" w:tblpY="1297"/>
+        <w:tblW w:w="9574" w:type="dxa"/>
         <w:tblLayout w:type="fixed"/>
         <w:tblLook w:val="04A0" w:firstRow="1" w:lastRow="0" w:firstColumn="1" w:lastColumn="0" w:noHBand="0" w:noVBand="1"/>
       </w:tblPr>
       <w:tblGrid>
-        <w:gridCol w:w="9360"/>
+        <w:gridCol w:w="9574"/>
       </w:tblGrid>
       <w:tr>
         <w:trPr>
-          <w:trHeight w:val="4824" w:hRule="exact"/>
-          <w:jc w:val="center"/>
+          <w:trHeight w:val="5636"/>
         </w:trPr>
         <w:tc>
           <w:tcPr>
-            <w:tcW w:w="9360" w:type="dxa"/>
+            <w:tcW w:w="9574" w:type="dxa"/>
             <w:tcBorders>
-              <w:top w:val="single" w:color="5C92A0" w:sz="8" w:space="0"/>
-              <w:left w:val="single" w:color="5C92A0" w:sz="8" w:space="0"/>
-              <w:bottom w:val="single" w:color="5C92A0" w:sz="8" w:space="0"/>
-              <w:right w:val="single" w:color="5C92A0" w:sz="8" w:space="0"/>
+              <w:top w:val="single" w:sz="8" w:space="0" w:color="5C92A0"/>
+              <w:left w:val="single" w:sz="8" w:space="0" w:color="5C92A0"/>
+              <w:bottom w:val="single" w:sz="8" w:space="0" w:color="5C92A0"/>
+              <w:right w:val="single" w:sz="8" w:space="0" w:color="5C92A0"/>
             </w:tcBorders>
             <w:tcMar>
               <w:top w:w="80" w:type="dxa"/>
@@ -1976,6 +1935,7 @@
                 <w:b/>
                 <w:color w:val="5A5A5A"/>
               </w:rPr>
+              <w:lastRenderedPageBreak/>
               <w:t>{</w:t>
             </w:r>
             <w:proofErr w:type="spellStart"/>
@@ -2006,24 +1966,31 @@
                 <w:color w:val="6E6E6E"/>
                 <w:sz w:val="16"/>
               </w:rPr>
-              <w:t>IMAGE AREA - preserve aspect ratio and center within frame</w:t>
+              <w:t>IMAGE AREA - preserve aspect ratio and center</w:t>
+            </w:r>
+            <w:r>
+              <w:rPr>
+                <w:i/>
+                <w:color w:val="6E6E6E"/>
+                <w:sz w:val="16"/>
+              </w:rPr>
+              <w:t>}</w:t>
             </w:r>
           </w:p>
         </w:tc>
       </w:tr>
       <w:tr>
         <w:trPr>
-          <w:trHeight w:val="605"/>
-          <w:jc w:val="center"/>
+          <w:trHeight w:val="706"/>
         </w:trPr>
         <w:tc>
           <w:tcPr>
-            <w:tcW w:w="9360" w:type="dxa"/>
+            <w:tcW w:w="9574" w:type="dxa"/>
             <w:tcBorders>
               <w:top w:val="nil"/>
-              <w:left w:val="single" w:color="5C92A0" w:sz="8" w:space="0"/>
-              <w:bottom w:val="single" w:color="5C92A0" w:sz="8" w:space="0"/>
-              <w:right w:val="single" w:color="5C92A0" w:sz="8" w:space="0"/>
+              <w:left w:val="single" w:sz="8" w:space="0" w:color="5C92A0"/>
+              <w:bottom w:val="single" w:sz="8" w:space="0" w:color="5C92A0"/>
+              <w:right w:val="single" w:sz="8" w:space="0" w:color="5C92A0"/>
             </w:tcBorders>
             <w:tcMar>
               <w:top w:w="60" w:type="dxa"/>
@@ -2079,17 +2046,16 @@
       </w:tr>
       <w:tr>
         <w:trPr>
-          <w:trHeight w:val="4824" w:hRule="exact"/>
-          <w:jc w:val="center"/>
+          <w:trHeight w:val="5636"/>
         </w:trPr>
         <w:tc>
           <w:tcPr>
-            <w:tcW w:w="9360" w:type="dxa"/>
+            <w:tcW w:w="9574" w:type="dxa"/>
             <w:tcBorders>
-              <w:top w:val="single" w:color="5C92A0" w:sz="8" w:space="0"/>
-              <w:left w:val="single" w:color="5C92A0" w:sz="8" w:space="0"/>
-              <w:bottom w:val="single" w:color="5C92A0" w:sz="8" w:space="0"/>
-              <w:right w:val="single" w:color="5C92A0" w:sz="8" w:space="0"/>
+              <w:top w:val="single" w:sz="8" w:space="0" w:color="5C92A0"/>
+              <w:left w:val="single" w:sz="8" w:space="0" w:color="5C92A0"/>
+              <w:bottom w:val="single" w:sz="8" w:space="0" w:color="5C92A0"/>
+              <w:right w:val="single" w:sz="8" w:space="0" w:color="5C92A0"/>
             </w:tcBorders>
             <w:tcMar>
               <w:top w:w="80" w:type="dxa"/>
@@ -2148,6 +2114,10 @@
             <w:pPr>
               <w:spacing w:before="80"/>
               <w:jc w:val="center"/>
+              <w:rPr>
+                <w:sz w:val="18"/>
+                <w:szCs w:val="24"/>
+              </w:rPr>
             </w:pPr>
             <w:r>
               <w:rPr>
@@ -2155,24 +2125,40 @@
                 <w:color w:val="6E6E6E"/>
                 <w:sz w:val="16"/>
               </w:rPr>
-              <w:t>IMAGE AREA - preserve aspect ratio and center within frame</w:t>
+              <w:t>{</w:t>
+            </w:r>
+            <w:r>
+              <w:rPr>
+                <w:i/>
+                <w:color w:val="6E6E6E"/>
+                <w:sz w:val="16"/>
+              </w:rPr>
+              <w:t>IMAGE AREA - preserve aspect ratio and center</w:t>
+            </w:r>
+            <w:r>
+              <w:rPr>
+                <w:i/>
+                <w:color w:val="6E6E6E"/>
+                <w:sz w:val="18"/>
+                <w:szCs w:val="24"/>
+              </w:rPr>
+              <w:t>}</w:t>
             </w:r>
           </w:p>
         </w:tc>
       </w:tr>
       <w:tr>
         <w:trPr>
-          <w:trHeight w:val="605"/>
-          <w:jc w:val="center"/>
+          <w:trHeight w:val="706"/>
         </w:trPr>
         <w:tc>
           <w:tcPr>
-            <w:tcW w:w="9360" w:type="dxa"/>
+            <w:tcW w:w="9574" w:type="dxa"/>
             <w:tcBorders>
               <w:top w:val="nil"/>
-              <w:left w:val="single" w:color="5C92A0" w:sz="8" w:space="0"/>
-              <w:bottom w:val="single" w:color="5C92A0" w:sz="8" w:space="0"/>
-              <w:right w:val="single" w:color="5C92A0" w:sz="8" w:space="0"/>
+              <w:left w:val="single" w:sz="8" w:space="0" w:color="5C92A0"/>
+              <w:bottom w:val="single" w:sz="8" w:space="0" w:color="5C92A0"/>
+              <w:right w:val="single" w:sz="8" w:space="0" w:color="5C92A0"/>
             </w:tcBorders>
             <w:tcMar>
               <w:top w:w="60" w:type="dxa"/>
@@ -2238,15 +2224,7 @@
           <w:color w:val="6E6E6E"/>
           <w:sz w:val="14"/>
         </w:rPr>
-        <w:t>{</w:t>
-      </w:r>
-      <w:r>
-        <w:rPr>
-          <w:i/>
-          <w:color w:val="6E6E6E"/>
-          <w:sz w:val="14"/>
-        </w:rPr>
-        <w:t xml:space="preserve">Repeat this photo page as needed; continue photo numbering </w:t>
+        <w:t xml:space="preserve">{Repeat this photo page as needed; continue photo numbering </w:t>
       </w:r>
       <w:proofErr w:type="gramStart"/>
       <w:r>
@@ -4384,18 +4362,19 @@
 </file>
 
 <file path=customXml/item1.xml><?xml version="1.0" encoding="utf-8"?>
-<p:properties xmlns:p="http://schemas.microsoft.com/office/2006/metadata/properties" xmlns:xsi="http://www.w3.org/2001/XMLSchema-instance" xmlns:pc="http://schemas.microsoft.com/office/infopath/2007/PartnerControls">
-  <documentManagement>
-    <TaxCatchAll xmlns="5c437b3f-8d58-4024-b6fc-a6a48772d55b" xsi:nil="true"/>
-    <lcf76f155ced4ddcb4097134ff3c332f xmlns="199911ad-b69d-4d0a-a4ca-d432eed627dc">
-      <Terms xmlns="http://schemas.microsoft.com/office/infopath/2007/PartnerControls"/>
-    </lcf76f155ced4ddcb4097134ff3c332f>
-    <Time xmlns="199911ad-b69d-4d0a-a4ca-d432eed627dc" xsi:nil="true"/>
-  </documentManagement>
-</p:properties>
+<?mso-contentType ?>
+<FormTemplates xmlns="http://schemas.microsoft.com/sharepoint/v3/contenttype/forms">
+  <Display>DocumentLibraryForm</Display>
+  <Edit>DocumentLibraryForm</Edit>
+  <New>DocumentLibraryForm</New>
+</FormTemplates>
 </file>
 
 <file path=customXml/item2.xml><?xml version="1.0" encoding="utf-8"?>
+<b:Sources xmlns:b="http://schemas.openxmlformats.org/officeDocument/2006/bibliography" xmlns="http://schemas.openxmlformats.org/officeDocument/2006/bibliography" SelectedStyle="\APASixthEditionOfficeOnline.xsl" StyleName="APA" Version="6"/>
+</file>
+
+<file path=customXml/item3.xml><?xml version="1.0" encoding="utf-8"?>
 <ct:contentTypeSchema xmlns:ct="http://schemas.microsoft.com/office/2006/metadata/contentType" xmlns:ma="http://schemas.microsoft.com/office/2006/metadata/properties/metaAttributes" ct:_="" ma:_="" ma:contentTypeName="Document" ma:contentTypeID="0x010100FC78D6365235654BACA01BB84945C621" ma:contentTypeVersion="22" ma:contentTypeDescription="Create a new document." ma:contentTypeScope="" ma:versionID="2ad49169a4b5f6586c8f496c15ea5a1a">
   <xsd:schema xmlns:xsd="http://www.w3.org/2001/XMLSchema" xmlns:xs="http://www.w3.org/2001/XMLSchema" xmlns:p="http://schemas.microsoft.com/office/2006/metadata/properties" xmlns:ns2="199911ad-b69d-4d0a-a4ca-d432eed627dc" xmlns:ns3="5c437b3f-8d58-4024-b6fc-a6a48772d55b" targetNamespace="http://schemas.microsoft.com/office/2006/metadata/properties" ma:root="true" ma:fieldsID="f5e1ce3868aefa1dd11ed41c8782106e" ns2:_="" ns3:_="">
     <xsd:import namespace="199911ad-b69d-4d0a-a4ca-d432eed627dc"/>
@@ -4662,31 +4641,35 @@
 </ct:contentTypeSchema>
 </file>
 
-<file path=customXml/item3.xml><?xml version="1.0" encoding="utf-8"?>
-<b:Sources xmlns:b="http://schemas.openxmlformats.org/officeDocument/2006/bibliography" xmlns="http://schemas.openxmlformats.org/officeDocument/2006/bibliography" SelectedStyle="\APASixthEditionOfficeOnline.xsl" StyleName="APA" Version="6"/>
-</file>
-
 <file path=customXml/item4.xml><?xml version="1.0" encoding="utf-8"?>
-<?mso-contentType ?>
-<FormTemplates xmlns="http://schemas.microsoft.com/sharepoint/v3/contenttype/forms">
-  <Display>DocumentLibraryForm</Display>
-  <Edit>DocumentLibraryForm</Edit>
-  <New>DocumentLibraryForm</New>
-</FormTemplates>
+<p:properties xmlns:p="http://schemas.microsoft.com/office/2006/metadata/properties" xmlns:xsi="http://www.w3.org/2001/XMLSchema-instance" xmlns:pc="http://schemas.microsoft.com/office/infopath/2007/PartnerControls">
+  <documentManagement>
+    <TaxCatchAll xmlns="5c437b3f-8d58-4024-b6fc-a6a48772d55b" xsi:nil="true"/>
+    <lcf76f155ced4ddcb4097134ff3c332f xmlns="199911ad-b69d-4d0a-a4ca-d432eed627dc">
+      <Terms xmlns="http://schemas.microsoft.com/office/infopath/2007/PartnerControls"/>
+    </lcf76f155ced4ddcb4097134ff3c332f>
+    <Time xmlns="199911ad-b69d-4d0a-a4ca-d432eed627dc" xsi:nil="true"/>
+  </documentManagement>
+</p:properties>
 </file>
 
 <file path=customXml/itemProps1.xml><?xml version="1.0" encoding="utf-8"?>
-<ds:datastoreItem xmlns:ds="http://schemas.openxmlformats.org/officeDocument/2006/customXml" ds:itemID="{E2E52A54-0EBA-421C-B8FD-DAADDB43ED73}">
+<ds:datastoreItem xmlns:ds="http://schemas.openxmlformats.org/officeDocument/2006/customXml" ds:itemID="{CAC6602E-4C73-4C33-A517-43C069B85AD5}">
   <ds:schemaRefs>
-    <ds:schemaRef ds:uri="http://schemas.microsoft.com/office/2006/metadata/properties"/>
-    <ds:schemaRef ds:uri="http://schemas.microsoft.com/office/infopath/2007/PartnerControls"/>
-    <ds:schemaRef ds:uri="5c437b3f-8d58-4024-b6fc-a6a48772d55b"/>
-    <ds:schemaRef ds:uri="199911ad-b69d-4d0a-a4ca-d432eed627dc"/>
+    <ds:schemaRef ds:uri="http://schemas.microsoft.com/sharepoint/v3/contenttype/forms"/>
   </ds:schemaRefs>
 </ds:datastoreItem>
 </file>
 
 <file path=customXml/itemProps2.xml><?xml version="1.0" encoding="utf-8"?>
+<ds:datastoreItem xmlns:ds="http://schemas.openxmlformats.org/officeDocument/2006/customXml" ds:itemID="{339A0E10-9C07-445F-BF91-3789EB954560}">
+  <ds:schemaRefs>
+    <ds:schemaRef ds:uri="http://schemas.openxmlformats.org/officeDocument/2006/bibliography"/>
+  </ds:schemaRefs>
+</ds:datastoreItem>
+</file>
+
+<file path=customXml/itemProps3.xml><?xml version="1.0" encoding="utf-8"?>
 <ds:datastoreItem xmlns:ds="http://schemas.openxmlformats.org/officeDocument/2006/customXml" ds:itemID="{1BB95DDE-D567-47B5-949A-4C609D51E51B}">
   <ds:schemaRefs>
     <ds:schemaRef ds:uri="http://schemas.microsoft.com/office/2006/metadata/contentType"/>
@@ -4705,18 +4688,13 @@
 </ds:datastoreItem>
 </file>
 
-<file path=customXml/itemProps3.xml><?xml version="1.0" encoding="utf-8"?>
-<ds:datastoreItem xmlns:ds="http://schemas.openxmlformats.org/officeDocument/2006/customXml" ds:itemID="{339A0E10-9C07-445F-BF91-3789EB954560}">
+<file path=customXml/itemProps4.xml><?xml version="1.0" encoding="utf-8"?>
+<ds:datastoreItem xmlns:ds="http://schemas.openxmlformats.org/officeDocument/2006/customXml" ds:itemID="{E2E52A54-0EBA-421C-B8FD-DAADDB43ED73}">
   <ds:schemaRefs>
-    <ds:schemaRef ds:uri="http://schemas.openxmlformats.org/officeDocument/2006/bibliography"/>
-  </ds:schemaRefs>
-</ds:datastoreItem>
-</file>
-
-<file path=customXml/itemProps4.xml><?xml version="1.0" encoding="utf-8"?>
-<ds:datastoreItem xmlns:ds="http://schemas.openxmlformats.org/officeDocument/2006/customXml" ds:itemID="{CAC6602E-4C73-4C33-A517-43C069B85AD5}">
-  <ds:schemaRefs>
-    <ds:schemaRef ds:uri="http://schemas.microsoft.com/sharepoint/v3/contenttype/forms"/>
+    <ds:schemaRef ds:uri="http://schemas.microsoft.com/office/2006/metadata/properties"/>
+    <ds:schemaRef ds:uri="http://schemas.microsoft.com/office/infopath/2007/PartnerControls"/>
+    <ds:schemaRef ds:uri="5c437b3f-8d58-4024-b6fc-a6a48772d55b"/>
+    <ds:schemaRef ds:uri="199911ad-b69d-4d0a-a4ca-d432eed627dc"/>
   </ds:schemaRefs>
 </ds:datastoreItem>
 </file>
</xml_diff>